<commit_message>
docs: sync latest report and final submission checks
</commit_message>
<xml_diff>
--- a/docs/week08/柳一帆2024150243AI协作日志W8.docx
+++ b/docs/week08/柳一帆2024150243AI协作日志W8.docx
@@ -1049,7 +1049,7 @@
         <w:adjustRightInd/>
         <w:snapToGrid/>
         <w:spacing w:after="0" w:line="240" w:lineRule="auto"/>
-        <w:ind w:left="0" w:leftChars="1000"/>
+        <w:ind w:left="2100" w:leftChars="1000"/>
         <w:textAlignment w:val="auto"/>
         <w:rPr>
           <w:rFonts w:hint="default" w:ascii="Times New Roman" w:hAnsi="Times New Roman" w:cs="Times New Roman"/>
@@ -1082,7 +1082,7 @@
         <w:adjustRightInd/>
         <w:snapToGrid/>
         <w:spacing w:after="0" w:line="240" w:lineRule="auto"/>
-        <w:ind w:left="0" w:leftChars="1000"/>
+        <w:ind w:left="2100" w:leftChars="1000"/>
         <w:textAlignment w:val="auto"/>
         <w:rPr>
           <w:rFonts w:hint="default" w:ascii="Times New Roman" w:hAnsi="Times New Roman" w:cs="Times New Roman"/>
@@ -1115,7 +1115,7 @@
         <w:adjustRightInd/>
         <w:snapToGrid/>
         <w:spacing w:after="0" w:line="240" w:lineRule="auto"/>
-        <w:ind w:left="0" w:leftChars="1000"/>
+        <w:ind w:left="2100" w:leftChars="1000"/>
         <w:textAlignment w:val="auto"/>
         <w:rPr>
           <w:rFonts w:hint="default" w:ascii="Times New Roman" w:hAnsi="Times New Roman" w:cs="Times New Roman"/>
@@ -1148,7 +1148,7 @@
         <w:adjustRightInd/>
         <w:snapToGrid/>
         <w:spacing w:after="0" w:line="240" w:lineRule="auto"/>
-        <w:ind w:left="0" w:leftChars="1000"/>
+        <w:ind w:left="2100" w:leftChars="1000"/>
         <w:textAlignment w:val="auto"/>
         <w:rPr>
           <w:rFonts w:hint="default" w:ascii="Times New Roman" w:hAnsi="Times New Roman" w:cs="Times New Roman"/>
@@ -1181,7 +1181,7 @@
         <w:adjustRightInd/>
         <w:snapToGrid/>
         <w:spacing w:after="0" w:line="240" w:lineRule="auto"/>
-        <w:ind w:left="0" w:leftChars="1000"/>
+        <w:ind w:left="2100" w:leftChars="1000"/>
         <w:textAlignment w:val="auto"/>
         <w:rPr>
           <w:rFonts w:hint="default" w:ascii="Times New Roman" w:hAnsi="Times New Roman" w:cs="Times New Roman"/>
@@ -1214,7 +1214,7 @@
         <w:adjustRightInd/>
         <w:snapToGrid/>
         <w:spacing w:after="0" w:line="240" w:lineRule="auto"/>
-        <w:ind w:left="0" w:leftChars="1000"/>
+        <w:ind w:left="2100" w:leftChars="1000"/>
         <w:textAlignment w:val="auto"/>
         <w:rPr>
           <w:rFonts w:hint="default" w:ascii="Times New Roman" w:hAnsi="Times New Roman" w:cs="Times New Roman"/>
@@ -1247,7 +1247,7 @@
         <w:adjustRightInd/>
         <w:snapToGrid/>
         <w:spacing w:after="0" w:line="240" w:lineRule="auto"/>
-        <w:ind w:left="0" w:leftChars="1000"/>
+        <w:ind w:left="2100" w:leftChars="1000"/>
         <w:textAlignment w:val="auto"/>
         <w:rPr>
           <w:rFonts w:hint="default" w:ascii="Times New Roman" w:hAnsi="Times New Roman" w:cs="Times New Roman"/>
@@ -1280,7 +1280,7 @@
         <w:adjustRightInd/>
         <w:snapToGrid/>
         <w:spacing w:after="0" w:line="240" w:lineRule="auto"/>
-        <w:ind w:left="0" w:leftChars="1000"/>
+        <w:ind w:left="2100" w:leftChars="1000"/>
         <w:textAlignment w:val="auto"/>
         <w:rPr>
           <w:rFonts w:hint="default" w:ascii="Times New Roman" w:hAnsi="Times New Roman" w:cs="Times New Roman"/>
@@ -1313,7 +1313,7 @@
         <w:adjustRightInd/>
         <w:snapToGrid/>
         <w:spacing w:after="0" w:line="240" w:lineRule="auto"/>
-        <w:ind w:left="0" w:leftChars="1000"/>
+        <w:ind w:left="2100" w:leftChars="1000"/>
         <w:textAlignment w:val="auto"/>
         <w:rPr>
           <w:rFonts w:hint="default" w:ascii="Times New Roman" w:hAnsi="Times New Roman" w:cs="Times New Roman"/>
@@ -1346,7 +1346,7 @@
         <w:adjustRightInd/>
         <w:snapToGrid/>
         <w:spacing w:after="0" w:line="240" w:lineRule="auto"/>
-        <w:ind w:left="0" w:leftChars="1000"/>
+        <w:ind w:left="2100" w:leftChars="1000"/>
         <w:textAlignment w:val="auto"/>
         <w:rPr>
           <w:rFonts w:hint="default" w:ascii="Times New Roman" w:hAnsi="Times New Roman" w:cs="Times New Roman"/>
@@ -1379,7 +1379,7 @@
         <w:adjustRightInd/>
         <w:snapToGrid/>
         <w:spacing w:after="0" w:line="240" w:lineRule="auto"/>
-        <w:ind w:left="0" w:leftChars="1000"/>
+        <w:ind w:left="2100" w:leftChars="1000"/>
         <w:textAlignment w:val="auto"/>
         <w:rPr>
           <w:rFonts w:hint="default" w:ascii="Times New Roman" w:hAnsi="Times New Roman" w:cs="Times New Roman"/>
@@ -1412,7 +1412,7 @@
         <w:adjustRightInd/>
         <w:snapToGrid/>
         <w:spacing w:after="0" w:line="240" w:lineRule="auto"/>
-        <w:ind w:left="0" w:leftChars="1000"/>
+        <w:ind w:left="2100" w:leftChars="1000"/>
         <w:textAlignment w:val="auto"/>
         <w:rPr>
           <w:rFonts w:hint="default" w:ascii="Times New Roman" w:hAnsi="Times New Roman" w:cs="Times New Roman"/>
@@ -1482,7 +1482,7 @@
     </w:p>
     <w:tbl>
       <w:tblPr>
-        <w:tblStyle w:val="33"/>
+        <w:tblStyle w:val="34"/>
         <w:tblW w:w="0" w:type="auto"/>
         <w:tblInd w:w="0" w:type="dxa"/>
         <w:tblBorders>
@@ -2384,6 +2384,9 @@
       <w:pPr>
         <w:keepNext/>
         <w:spacing w:after="120" w:line="276" w:lineRule="auto"/>
+        <w:rPr>
+          <w:rFonts w:hint="default" w:ascii="Times New Roman" w:hAnsi="Times New Roman" w:cs="Times New Roman"/>
+        </w:rPr>
       </w:pPr>
       <w:r>
         <w:rPr>
@@ -2391,18 +2394,29 @@
           <w:b/>
           <w:sz w:val="21"/>
         </w:rPr>
-        <w:t>修复后的关键分流</w:t>
+        <w:t>修复后的关</w:t>
+      </w:r>
+      <w:r>
+        <w:rPr>
+          <w:rFonts w:hint="default" w:ascii="Times New Roman" w:hAnsi="Times New Roman" w:eastAsia="宋体" w:cs="Times New Roman"/>
+          <w:b/>
+          <w:sz w:val="21"/>
+        </w:rPr>
+        <w:t>键分流</w:t>
       </w:r>
     </w:p>
     <w:p>
       <w:pPr>
         <w:keepNext/>
         <w:spacing w:after="0" w:line="252" w:lineRule="auto"/>
-        <w:ind w:leftChars="600"/>
+        <w:ind w:leftChars="900"/>
+        <w:rPr>
+          <w:rFonts w:hint="default" w:ascii="Times New Roman" w:hAnsi="Times New Roman" w:cs="Times New Roman"/>
+        </w:rPr>
       </w:pPr>
       <w:r>
         <w:rPr>
-          <w:rFonts w:ascii="Consolas" w:hAnsi="Consolas" w:eastAsia="宋体"/>
+          <w:rFonts w:hint="default" w:ascii="Times New Roman" w:hAnsi="Times New Roman" w:eastAsia="宋体" w:cs="Times New Roman"/>
           <w:b w:val="0"/>
           <w:sz w:val="19"/>
         </w:rPr>
@@ -2413,11 +2427,14 @@
       <w:pPr>
         <w:keepNext/>
         <w:spacing w:after="0" w:line="252" w:lineRule="auto"/>
-        <w:ind w:leftChars="600"/>
+        <w:ind w:leftChars="900"/>
+        <w:rPr>
+          <w:rFonts w:hint="default" w:ascii="Times New Roman" w:hAnsi="Times New Roman" w:cs="Times New Roman"/>
+        </w:rPr>
       </w:pPr>
       <w:r>
         <w:rPr>
-          <w:rFonts w:ascii="Consolas" w:hAnsi="Consolas" w:eastAsia="宋体"/>
+          <w:rFonts w:hint="default" w:ascii="Times New Roman" w:hAnsi="Times New Roman" w:eastAsia="宋体" w:cs="Times New Roman"/>
           <w:b w:val="0"/>
           <w:sz w:val="19"/>
         </w:rPr>
@@ -2428,11 +2445,14 @@
       <w:pPr>
         <w:keepNext/>
         <w:spacing w:after="0" w:line="252" w:lineRule="auto"/>
-        <w:ind w:leftChars="600"/>
+        <w:ind w:leftChars="900"/>
+        <w:rPr>
+          <w:rFonts w:hint="default" w:ascii="Times New Roman" w:hAnsi="Times New Roman" w:cs="Times New Roman"/>
+        </w:rPr>
       </w:pPr>
       <w:r>
         <w:rPr>
-          <w:rFonts w:ascii="Consolas" w:hAnsi="Consolas" w:eastAsia="宋体"/>
+          <w:rFonts w:hint="default" w:ascii="Times New Roman" w:hAnsi="Times New Roman" w:eastAsia="宋体" w:cs="Times New Roman"/>
           <w:b w:val="0"/>
           <w:sz w:val="19"/>
         </w:rPr>
@@ -2443,11 +2463,14 @@
       <w:pPr>
         <w:keepNext/>
         <w:spacing w:after="0" w:line="252" w:lineRule="auto"/>
-        <w:ind w:leftChars="600"/>
+        <w:ind w:leftChars="900"/>
+        <w:rPr>
+          <w:rFonts w:hint="default" w:ascii="Times New Roman" w:hAnsi="Times New Roman" w:cs="Times New Roman"/>
+        </w:rPr>
       </w:pPr>
       <w:r>
         <w:rPr>
-          <w:rFonts w:ascii="Consolas" w:hAnsi="Consolas" w:eastAsia="宋体"/>
+          <w:rFonts w:hint="default" w:ascii="Times New Roman" w:hAnsi="Times New Roman" w:eastAsia="宋体" w:cs="Times New Roman"/>
           <w:b w:val="0"/>
           <w:sz w:val="19"/>
         </w:rPr>
@@ -2458,11 +2481,14 @@
       <w:pPr>
         <w:keepNext/>
         <w:spacing w:after="0" w:line="252" w:lineRule="auto"/>
-        <w:ind w:leftChars="600"/>
+        <w:ind w:leftChars="900"/>
+        <w:rPr>
+          <w:rFonts w:hint="default" w:ascii="Times New Roman" w:hAnsi="Times New Roman" w:cs="Times New Roman"/>
+        </w:rPr>
       </w:pPr>
       <w:r>
         <w:rPr>
-          <w:rFonts w:ascii="Consolas" w:hAnsi="Consolas" w:eastAsia="宋体"/>
+          <w:rFonts w:hint="default" w:ascii="Times New Roman" w:hAnsi="Times New Roman" w:eastAsia="宋体" w:cs="Times New Roman"/>
           <w:b w:val="0"/>
           <w:sz w:val="19"/>
         </w:rPr>
@@ -2473,11 +2499,14 @@
       <w:pPr>
         <w:keepNext/>
         <w:spacing w:after="0" w:line="252" w:lineRule="auto"/>
-        <w:ind w:leftChars="600"/>
+        <w:ind w:leftChars="900"/>
+        <w:rPr>
+          <w:rFonts w:hint="default" w:ascii="Times New Roman" w:hAnsi="Times New Roman" w:cs="Times New Roman"/>
+        </w:rPr>
       </w:pPr>
       <w:r>
         <w:rPr>
-          <w:rFonts w:ascii="Consolas" w:hAnsi="Consolas" w:eastAsia="宋体"/>
+          <w:rFonts w:hint="default" w:ascii="Times New Roman" w:hAnsi="Times New Roman" w:eastAsia="宋体" w:cs="Times New Roman"/>
           <w:b w:val="0"/>
           <w:sz w:val="19"/>
         </w:rPr>
@@ -2487,11 +2516,14 @@
     <w:p>
       <w:pPr>
         <w:spacing w:after="80" w:line="252" w:lineRule="auto"/>
-        <w:ind w:leftChars="600"/>
+        <w:ind w:leftChars="900"/>
+        <w:rPr>
+          <w:rFonts w:hint="default" w:ascii="Times New Roman" w:hAnsi="Times New Roman" w:cs="Times New Roman"/>
+        </w:rPr>
       </w:pPr>
       <w:r>
         <w:rPr>
-          <w:rFonts w:ascii="Consolas" w:hAnsi="Consolas" w:eastAsia="宋体"/>
+          <w:rFonts w:hint="default" w:ascii="Times New Roman" w:hAnsi="Times New Roman" w:eastAsia="宋体" w:cs="Times New Roman"/>
           <w:b w:val="0"/>
           <w:sz w:val="19"/>
         </w:rPr>
@@ -2552,7 +2584,7 @@
     </w:p>
     <w:tbl>
       <w:tblPr>
-        <w:tblStyle w:val="33"/>
+        <w:tblStyle w:val="34"/>
         <w:tblW w:w="0" w:type="auto"/>
         <w:tblInd w:w="0" w:type="dxa"/>
         <w:tblBorders>
@@ -2585,12 +2617,6 @@
             <w:insideH w:val="single" w:color="auto" w:sz="4" w:space="0"/>
             <w:insideV w:val="single" w:color="auto" w:sz="4" w:space="0"/>
           </w:tblBorders>
-          <w:tblCellMar>
-            <w:top w:w="0" w:type="dxa"/>
-            <w:left w:w="108" w:type="dxa"/>
-            <w:bottom w:w="0" w:type="dxa"/>
-            <w:right w:w="108" w:type="dxa"/>
-          </w:tblCellMar>
         </w:tblPrEx>
         <w:trPr>
           <w:cantSplit/>
@@ -3153,7 +3179,7 @@
         <w:rPr>
           <w:rFonts w:hint="eastAsia"/>
         </w:rPr>
-        <w:t>三、任务 3：独立迁移</w:t>
+        <w:t>三、任务 3：独立迁移（本任务严禁使用 AI）</w:t>
       </w:r>
     </w:p>
     <w:p>
@@ -3167,15 +3193,7 @@
         <w:rPr>
           <w:rFonts w:hint="eastAsia"/>
         </w:rPr>
-        <w:t>任务要求：为列表增加一个“</w:t>
-      </w:r>
-      <w:bookmarkStart w:id="0" w:name="_GoBack"/>
-      <w:bookmarkEnd w:id="0"/>
-      <w:r>
-        <w:rPr>
-          <w:rFonts w:hint="eastAsia"/>
-        </w:rPr>
-        <w:t>编辑”分支。重点是</w:t>
+        <w:t>任务要求：为列表增加一个“编辑”分支。重点是</w:t>
       </w:r>
       <w:r>
         <w:rPr>
@@ -3270,7 +3288,737 @@
         <w:keepNext/>
         <w:keepLines/>
         <w:pageBreakBefore w:val="0"/>
-        <w:spacing w:after="0" w:line="252" w:lineRule="auto" w:before="0"/>
+        <w:spacing w:before="0" w:after="0" w:line="252" w:lineRule="auto"/>
+        <w:ind w:leftChars="800"/>
+        <w:rPr>
+          <w:rFonts w:hint="default" w:ascii="Times New Roman" w:hAnsi="Times New Roman" w:cs="Times New Roman"/>
+        </w:rPr>
+      </w:pPr>
+      <w:r>
+        <w:rPr>
+          <w:rFonts w:hint="default" w:ascii="Times New Roman" w:hAnsi="Times New Roman" w:eastAsia="宋体" w:cs="Times New Roman"/>
+          <w:b w:val="0"/>
+          <w:color w:val="000000"/>
+          <w:sz w:val="19"/>
+        </w:rPr>
+        <w:t>// render() 中创建编辑按钮，后续只追加节点</w:t>
+      </w:r>
+    </w:p>
+    <w:p>
+      <w:pPr>
+        <w:keepNext/>
+        <w:keepLines/>
+        <w:pageBreakBefore w:val="0"/>
+        <w:spacing w:before="0" w:after="0" w:line="252" w:lineRule="auto"/>
+        <w:ind w:leftChars="800"/>
+        <w:rPr>
+          <w:rFonts w:hint="default" w:ascii="Times New Roman" w:hAnsi="Times New Roman" w:cs="Times New Roman"/>
+        </w:rPr>
+      </w:pPr>
+      <w:r>
+        <w:rPr>
+          <w:rFonts w:hint="default" w:ascii="Times New Roman" w:hAnsi="Times New Roman" w:eastAsia="宋体" w:cs="Times New Roman"/>
+          <w:b w:val="0"/>
+          <w:color w:val="000000"/>
+          <w:sz w:val="19"/>
+        </w:rPr>
+        <w:t>const edit = document.createElement('button');</w:t>
+      </w:r>
+    </w:p>
+    <w:p>
+      <w:pPr>
+        <w:keepNext/>
+        <w:keepLines/>
+        <w:pageBreakBefore w:val="0"/>
+        <w:spacing w:before="0" w:after="0" w:line="252" w:lineRule="auto"/>
+        <w:ind w:leftChars="800"/>
+        <w:rPr>
+          <w:rFonts w:hint="default" w:ascii="Times New Roman" w:hAnsi="Times New Roman" w:cs="Times New Roman"/>
+        </w:rPr>
+      </w:pPr>
+      <w:r>
+        <w:rPr>
+          <w:rFonts w:hint="default" w:ascii="Times New Roman" w:hAnsi="Times New Roman" w:eastAsia="宋体" w:cs="Times New Roman"/>
+          <w:b w:val="0"/>
+          <w:color w:val="000000"/>
+          <w:sz w:val="19"/>
+        </w:rPr>
+        <w:t>edit.type = 'button';</w:t>
+      </w:r>
+    </w:p>
+    <w:p>
+      <w:pPr>
+        <w:keepNext/>
+        <w:keepLines/>
+        <w:pageBreakBefore w:val="0"/>
+        <w:spacing w:before="0" w:after="0" w:line="252" w:lineRule="auto"/>
+        <w:ind w:leftChars="800"/>
+        <w:rPr>
+          <w:rFonts w:hint="default" w:ascii="Times New Roman" w:hAnsi="Times New Roman" w:cs="Times New Roman"/>
+        </w:rPr>
+      </w:pPr>
+      <w:r>
+        <w:rPr>
+          <w:rFonts w:hint="default" w:ascii="Times New Roman" w:hAnsi="Times New Roman" w:eastAsia="宋体" w:cs="Times New Roman"/>
+          <w:b w:val="0"/>
+          <w:color w:val="000000"/>
+          <w:sz w:val="19"/>
+        </w:rPr>
+        <w:t>edit.dataset.action = 'edit';</w:t>
+      </w:r>
+    </w:p>
+    <w:p>
+      <w:pPr>
+        <w:keepNext w:val="0"/>
+        <w:keepLines/>
+        <w:pageBreakBefore w:val="0"/>
+        <w:spacing w:before="0" w:after="0" w:line="252" w:lineRule="auto"/>
+        <w:ind w:leftChars="800"/>
+        <w:rPr>
+          <w:rFonts w:hint="default" w:ascii="Times New Roman" w:hAnsi="Times New Roman" w:cs="Times New Roman"/>
+        </w:rPr>
+      </w:pPr>
+      <w:r>
+        <w:rPr>
+          <w:rFonts w:hint="default" w:ascii="Times New Roman" w:hAnsi="Times New Roman" w:eastAsia="宋体" w:cs="Times New Roman"/>
+          <w:b w:val="0"/>
+          <w:color w:val="000000"/>
+          <w:sz w:val="19"/>
+        </w:rPr>
+        <w:t>// 原有代码继续设置文字并追加到 li</w:t>
+      </w:r>
+    </w:p>
+    <w:p>
+      <w:pPr>
+        <w:keepNext w:val="0"/>
+        <w:keepLines/>
+        <w:pageBreakBefore w:val="0"/>
+        <w:spacing w:before="0" w:after="0" w:line="252" w:lineRule="auto"/>
+        <w:ind w:leftChars="800"/>
+        <w:rPr>
+          <w:rFonts w:hint="default" w:ascii="Times New Roman" w:hAnsi="Times New Roman" w:cs="Times New Roman"/>
+        </w:rPr>
+      </w:pPr>
+    </w:p>
+    <w:p>
+      <w:pPr>
+        <w:keepNext/>
+        <w:keepLines/>
+        <w:pageBreakBefore w:val="0"/>
+        <w:spacing w:before="0" w:after="0" w:line="252" w:lineRule="auto"/>
+        <w:ind w:leftChars="800"/>
+        <w:rPr>
+          <w:rFonts w:hint="default" w:ascii="Times New Roman" w:hAnsi="Times New Roman" w:cs="Times New Roman"/>
+        </w:rPr>
+      </w:pPr>
+      <w:r>
+        <w:rPr>
+          <w:rFonts w:hint="default" w:ascii="Times New Roman" w:hAnsi="Times New Roman" w:eastAsia="宋体" w:cs="Times New Roman"/>
+          <w:b w:val="0"/>
+          <w:color w:val="000000"/>
+          <w:sz w:val="19"/>
+        </w:rPr>
+        <w:t>// handleListClick() 中，沿用前面的 li 和数字 id 检查</w:t>
+      </w:r>
+    </w:p>
+    <w:p>
+      <w:pPr>
+        <w:keepNext/>
+        <w:keepLines/>
+        <w:pageBreakBefore w:val="0"/>
+        <w:spacing w:before="0" w:after="0" w:line="252" w:lineRule="auto"/>
+        <w:ind w:leftChars="800"/>
+        <w:rPr>
+          <w:rFonts w:hint="default" w:ascii="Times New Roman" w:hAnsi="Times New Roman" w:cs="Times New Roman"/>
+        </w:rPr>
+      </w:pPr>
+      <w:r>
+        <w:rPr>
+          <w:rFonts w:hint="default" w:ascii="Times New Roman" w:hAnsi="Times New Roman" w:eastAsia="宋体" w:cs="Times New Roman"/>
+          <w:b w:val="0"/>
+          <w:color w:val="000000"/>
+          <w:sz w:val="19"/>
+        </w:rPr>
+        <w:t>const actionButton = e.target.closest('button[data-action]');</w:t>
+      </w:r>
+    </w:p>
+    <w:p>
+      <w:pPr>
+        <w:keepNext/>
+        <w:keepLines/>
+        <w:pageBreakBefore w:val="0"/>
+        <w:spacing w:before="0" w:after="0" w:line="252" w:lineRule="auto"/>
+        <w:ind w:leftChars="800"/>
+        <w:rPr>
+          <w:rFonts w:hint="default" w:ascii="Times New Roman" w:hAnsi="Times New Roman" w:cs="Times New Roman"/>
+        </w:rPr>
+      </w:pPr>
+      <w:r>
+        <w:rPr>
+          <w:rFonts w:hint="default" w:ascii="Times New Roman" w:hAnsi="Times New Roman" w:eastAsia="宋体" w:cs="Times New Roman"/>
+          <w:b w:val="0"/>
+          <w:color w:val="000000"/>
+          <w:sz w:val="19"/>
+        </w:rPr>
+        <w:t>if (actionButton &amp;&amp; !item.contains(actionButton)) return;</w:t>
+      </w:r>
+    </w:p>
+    <w:p>
+      <w:pPr>
+        <w:keepNext w:val="0"/>
+        <w:keepLines/>
+        <w:pageBreakBefore w:val="0"/>
+        <w:spacing w:before="0" w:after="0" w:line="252" w:lineRule="auto"/>
+        <w:ind w:leftChars="800"/>
+        <w:rPr>
+          <w:rFonts w:hint="default" w:ascii="Times New Roman" w:hAnsi="Times New Roman" w:cs="Times New Roman"/>
+        </w:rPr>
+      </w:pPr>
+      <w:r>
+        <w:rPr>
+          <w:rFonts w:hint="default" w:ascii="Times New Roman" w:hAnsi="Times New Roman" w:eastAsia="宋体" w:cs="Times New Roman"/>
+          <w:b w:val="0"/>
+          <w:color w:val="000000"/>
+          <w:sz w:val="19"/>
+        </w:rPr>
+        <w:t>const action = actionButton ? actionButton.dataset.action : null;</w:t>
+      </w:r>
+    </w:p>
+    <w:p>
+      <w:pPr>
+        <w:keepNext w:val="0"/>
+        <w:keepLines/>
+        <w:pageBreakBefore w:val="0"/>
+        <w:spacing w:before="0" w:after="0" w:line="252" w:lineRule="auto"/>
+        <w:ind w:leftChars="800"/>
+        <w:rPr>
+          <w:rFonts w:hint="default" w:ascii="Times New Roman" w:hAnsi="Times New Roman" w:cs="Times New Roman"/>
+        </w:rPr>
+      </w:pPr>
+    </w:p>
+    <w:p>
+      <w:pPr>
+        <w:keepNext/>
+        <w:keepLines/>
+        <w:pageBreakBefore w:val="0"/>
+        <w:spacing w:before="0" w:after="0" w:line="252" w:lineRule="auto"/>
+        <w:ind w:leftChars="800"/>
+        <w:rPr>
+          <w:rFonts w:hint="default" w:ascii="Times New Roman" w:hAnsi="Times New Roman" w:cs="Times New Roman"/>
+        </w:rPr>
+      </w:pPr>
+      <w:r>
+        <w:rPr>
+          <w:rFonts w:hint="default" w:ascii="Times New Roman" w:hAnsi="Times New Roman" w:eastAsia="宋体" w:cs="Times New Roman"/>
+          <w:b w:val="0"/>
+          <w:color w:val="000000"/>
+          <w:sz w:val="19"/>
+        </w:rPr>
+        <w:t>if (action === 'delete') {</w:t>
+      </w:r>
+    </w:p>
+    <w:p>
+      <w:pPr>
+        <w:keepNext/>
+        <w:keepLines/>
+        <w:pageBreakBefore w:val="0"/>
+        <w:spacing w:before="0" w:after="0" w:line="252" w:lineRule="auto"/>
+        <w:ind w:leftChars="800"/>
+        <w:rPr>
+          <w:rFonts w:hint="default" w:ascii="Times New Roman" w:hAnsi="Times New Roman" w:cs="Times New Roman"/>
+        </w:rPr>
+      </w:pPr>
+      <w:r>
+        <w:rPr>
+          <w:rFonts w:hint="default" w:ascii="Times New Roman" w:hAnsi="Times New Roman" w:eastAsia="宋体" w:cs="Times New Roman"/>
+          <w:b w:val="0"/>
+          <w:color w:val="000000"/>
+          <w:sz w:val="19"/>
+        </w:rPr>
+        <w:t xml:space="preserve">    deleteTodo(id);</w:t>
+      </w:r>
+    </w:p>
+    <w:p>
+      <w:pPr>
+        <w:keepNext/>
+        <w:keepLines/>
+        <w:pageBreakBefore w:val="0"/>
+        <w:spacing w:before="0" w:after="0" w:line="252" w:lineRule="auto"/>
+        <w:ind w:leftChars="800"/>
+        <w:rPr>
+          <w:rFonts w:hint="default" w:ascii="Times New Roman" w:hAnsi="Times New Roman" w:cs="Times New Roman"/>
+        </w:rPr>
+      </w:pPr>
+      <w:r>
+        <w:rPr>
+          <w:rFonts w:hint="default" w:ascii="Times New Roman" w:hAnsi="Times New Roman" w:eastAsia="宋体" w:cs="Times New Roman"/>
+          <w:b w:val="0"/>
+          <w:color w:val="000000"/>
+          <w:sz w:val="19"/>
+        </w:rPr>
+        <w:t>} else if (action === 'edit') {</w:t>
+      </w:r>
+    </w:p>
+    <w:p>
+      <w:pPr>
+        <w:keepNext/>
+        <w:keepLines/>
+        <w:pageBreakBefore w:val="0"/>
+        <w:spacing w:before="0" w:after="0" w:line="252" w:lineRule="auto"/>
+        <w:ind w:leftChars="800"/>
+        <w:rPr>
+          <w:rFonts w:hint="default" w:ascii="Times New Roman" w:hAnsi="Times New Roman" w:cs="Times New Roman"/>
+        </w:rPr>
+      </w:pPr>
+      <w:r>
+        <w:rPr>
+          <w:rFonts w:hint="default" w:ascii="Times New Roman" w:hAnsi="Times New Roman" w:eastAsia="宋体" w:cs="Times New Roman"/>
+          <w:b w:val="0"/>
+          <w:color w:val="000000"/>
+          <w:sz w:val="19"/>
+        </w:rPr>
+        <w:t xml:space="preserve">    const todo = todos.find(todo =&gt; todo.id === id);</w:t>
+      </w:r>
+    </w:p>
+    <w:p>
+      <w:pPr>
+        <w:keepNext/>
+        <w:keepLines/>
+        <w:pageBreakBefore w:val="0"/>
+        <w:spacing w:before="0" w:after="0" w:line="252" w:lineRule="auto"/>
+        <w:ind w:leftChars="800"/>
+        <w:rPr>
+          <w:rFonts w:hint="default" w:ascii="Times New Roman" w:hAnsi="Times New Roman" w:cs="Times New Roman"/>
+        </w:rPr>
+      </w:pPr>
+      <w:r>
+        <w:rPr>
+          <w:rFonts w:hint="default" w:ascii="Times New Roman" w:hAnsi="Times New Roman" w:eastAsia="宋体" w:cs="Times New Roman"/>
+          <w:b w:val="0"/>
+          <w:color w:val="000000"/>
+          <w:sz w:val="19"/>
+        </w:rPr>
+        <w:t xml:space="preserve">    const text = window.prompt('修改任务', todo.text);</w:t>
+      </w:r>
+    </w:p>
+    <w:p>
+      <w:pPr>
+        <w:keepNext/>
+        <w:keepLines/>
+        <w:pageBreakBefore w:val="0"/>
+        <w:spacing w:before="0" w:after="0" w:line="252" w:lineRule="auto"/>
+        <w:ind w:leftChars="800"/>
+        <w:rPr>
+          <w:rFonts w:hint="default" w:ascii="Times New Roman" w:hAnsi="Times New Roman" w:cs="Times New Roman"/>
+        </w:rPr>
+      </w:pPr>
+      <w:r>
+        <w:rPr>
+          <w:rFonts w:hint="default" w:ascii="Times New Roman" w:hAnsi="Times New Roman" w:eastAsia="宋体" w:cs="Times New Roman"/>
+          <w:b w:val="0"/>
+          <w:color w:val="000000"/>
+          <w:sz w:val="19"/>
+        </w:rPr>
+        <w:t xml:space="preserve">    if (text === null) return;</w:t>
+      </w:r>
+    </w:p>
+    <w:p>
+      <w:pPr>
+        <w:keepNext/>
+        <w:keepLines/>
+        <w:pageBreakBefore w:val="0"/>
+        <w:spacing w:before="0" w:after="0" w:line="252" w:lineRule="auto"/>
+        <w:ind w:leftChars="800"/>
+        <w:rPr>
+          <w:rFonts w:hint="default" w:ascii="Times New Roman" w:hAnsi="Times New Roman" w:cs="Times New Roman"/>
+        </w:rPr>
+      </w:pPr>
+      <w:r>
+        <w:rPr>
+          <w:rFonts w:hint="default" w:ascii="Times New Roman" w:hAnsi="Times New Roman" w:eastAsia="宋体" w:cs="Times New Roman"/>
+          <w:b w:val="0"/>
+          <w:color w:val="000000"/>
+          <w:sz w:val="19"/>
+        </w:rPr>
+        <w:t xml:space="preserve">    updateTodo(id, text);</w:t>
+      </w:r>
+    </w:p>
+    <w:p>
+      <w:pPr>
+        <w:keepNext/>
+        <w:keepLines/>
+        <w:pageBreakBefore w:val="0"/>
+        <w:spacing w:before="0" w:after="0" w:line="252" w:lineRule="auto"/>
+        <w:ind w:leftChars="800"/>
+        <w:rPr>
+          <w:rFonts w:hint="default" w:ascii="Times New Roman" w:hAnsi="Times New Roman" w:cs="Times New Roman"/>
+        </w:rPr>
+      </w:pPr>
+      <w:r>
+        <w:rPr>
+          <w:rFonts w:hint="default" w:ascii="Times New Roman" w:hAnsi="Times New Roman" w:eastAsia="宋体" w:cs="Times New Roman"/>
+          <w:b w:val="0"/>
+          <w:color w:val="000000"/>
+          <w:sz w:val="19"/>
+        </w:rPr>
+        <w:t>} else {</w:t>
+      </w:r>
+    </w:p>
+    <w:p>
+      <w:pPr>
+        <w:keepNext/>
+        <w:keepLines/>
+        <w:pageBreakBefore w:val="0"/>
+        <w:spacing w:before="0" w:after="0" w:line="252" w:lineRule="auto"/>
+        <w:ind w:leftChars="800"/>
+        <w:rPr>
+          <w:rFonts w:hint="default" w:ascii="Times New Roman" w:hAnsi="Times New Roman" w:cs="Times New Roman"/>
+        </w:rPr>
+      </w:pPr>
+      <w:r>
+        <w:rPr>
+          <w:rFonts w:hint="default" w:ascii="Times New Roman" w:hAnsi="Times New Roman" w:eastAsia="宋体" w:cs="Times New Roman"/>
+          <w:b w:val="0"/>
+          <w:color w:val="000000"/>
+          <w:sz w:val="19"/>
+        </w:rPr>
+        <w:t xml:space="preserve">    if (actionButton) return;</w:t>
+      </w:r>
+    </w:p>
+    <w:p>
+      <w:pPr>
+        <w:keepNext/>
+        <w:keepLines/>
+        <w:pageBreakBefore w:val="0"/>
+        <w:spacing w:before="0" w:after="0" w:line="252" w:lineRule="auto"/>
+        <w:ind w:leftChars="800"/>
+        <w:rPr>
+          <w:rFonts w:hint="default" w:ascii="Times New Roman" w:hAnsi="Times New Roman" w:cs="Times New Roman"/>
+        </w:rPr>
+      </w:pPr>
+      <w:r>
+        <w:rPr>
+          <w:rFonts w:hint="default" w:ascii="Times New Roman" w:hAnsi="Times New Roman" w:eastAsia="宋体" w:cs="Times New Roman"/>
+          <w:b w:val="0"/>
+          <w:color w:val="000000"/>
+          <w:sz w:val="19"/>
+        </w:rPr>
+        <w:t xml:space="preserve">    if (e.target.matches('input[type="checkbox"]')) e.preventDefault();</w:t>
+      </w:r>
+    </w:p>
+    <w:p>
+      <w:pPr>
+        <w:keepNext/>
+        <w:keepLines/>
+        <w:pageBreakBefore w:val="0"/>
+        <w:spacing w:before="0" w:after="0" w:line="252" w:lineRule="auto"/>
+        <w:ind w:leftChars="800"/>
+        <w:rPr>
+          <w:rFonts w:hint="default" w:ascii="Times New Roman" w:hAnsi="Times New Roman" w:cs="Times New Roman"/>
+        </w:rPr>
+      </w:pPr>
+      <w:r>
+        <w:rPr>
+          <w:rFonts w:hint="default" w:ascii="Times New Roman" w:hAnsi="Times New Roman" w:eastAsia="宋体" w:cs="Times New Roman"/>
+          <w:b w:val="0"/>
+          <w:color w:val="000000"/>
+          <w:sz w:val="19"/>
+        </w:rPr>
+        <w:t xml:space="preserve">    toggleTodo(id);</w:t>
+      </w:r>
+    </w:p>
+    <w:p>
+      <w:pPr>
+        <w:keepNext w:val="0"/>
+        <w:keepLines/>
+        <w:pageBreakBefore w:val="0"/>
+        <w:spacing w:before="0" w:after="120" w:line="252" w:lineRule="auto"/>
+        <w:ind w:leftChars="800"/>
+        <w:rPr>
+          <w:rFonts w:hint="default" w:ascii="Times New Roman" w:hAnsi="Times New Roman" w:cs="Times New Roman"/>
+        </w:rPr>
+      </w:pPr>
+      <w:r>
+        <w:rPr>
+          <w:rFonts w:hint="default" w:ascii="Times New Roman" w:hAnsi="Times New Roman" w:eastAsia="宋体" w:cs="Times New Roman"/>
+          <w:b w:val="0"/>
+          <w:color w:val="000000"/>
+          <w:sz w:val="19"/>
+        </w:rPr>
+        <w:t>}</w:t>
+      </w:r>
+    </w:p>
+    <w:p>
+      <w:pPr>
+        <w:keepNext w:val="0"/>
+        <w:keepLines/>
+        <w:pageBreakBefore w:val="0"/>
+        <w:spacing w:before="0" w:after="120" w:line="276" w:lineRule="auto"/>
+        <w:rPr>
+          <w:rFonts w:hint="eastAsia"/>
+        </w:rPr>
+      </w:pPr>
+      <w:r>
+        <w:rPr>
+          <w:rFonts w:ascii="Calibri" w:hAnsi="Calibri" w:eastAsia="宋体"/>
+          <w:b w:val="0"/>
+          <w:color w:val="000000"/>
+          <w:sz w:val="21"/>
+        </w:rPr>
+        <w:t>取原文字是迁移时需要想清楚的一步。以前逐项绑定回调时，可以直接用循环里的任务变量；现在监听器放在 ul 上，回调里只先拿到事件和 id。我不能把渲染循环里的变量直接搬进来，而是先用 todos.find() 找到当前任务，再把 todo.text 放进输入框。这里的 id 已经由 Number(item.dataset.id) 转成数字，并检查过任务存在，才能和第七周保存的数字 id 对上。</w:t>
+      </w:r>
+    </w:p>
+    <w:p>
+      <w:pPr>
+        <w:keepNext/>
+        <w:keepLines/>
+        <w:pageBreakBefore w:val="0"/>
+        <w:spacing w:before="0" w:after="120" w:line="276" w:lineRule="auto"/>
+        <w:rPr>
+          <w:rFonts w:hint="eastAsia"/>
+        </w:rPr>
+      </w:pPr>
+      <w:r>
+        <w:rPr>
+          <w:rFonts w:ascii="Calibri" w:hAnsi="Calibri" w:eastAsia="宋体"/>
+          <w:b/>
+          <w:color w:val="000000"/>
+          <w:sz w:val="21"/>
+        </w:rPr>
+        <w:t>2. 把取消、空输入和有效修改分开</w:t>
+      </w:r>
+    </w:p>
+    <w:p>
+      <w:pPr>
+        <w:keepNext w:val="0"/>
+        <w:keepLines/>
+        <w:pageBreakBefore w:val="0"/>
+        <w:spacing w:before="0" w:after="120" w:line="276" w:lineRule="auto"/>
+        <w:rPr>
+          <w:rFonts w:hint="eastAsia"/>
+        </w:rPr>
+      </w:pPr>
+      <w:r>
+        <w:rPr>
+          <w:rFonts w:ascii="Calibri" w:hAnsi="Calibri" w:eastAsia="宋体"/>
+          <w:b w:val="0"/>
+          <w:color w:val="000000"/>
+          <w:sz w:val="21"/>
+        </w:rPr>
+        <w:t>输入判断不能只看“有没有新文字”。点取消时 prompt() 返回 null，直接 trim() 会报错；点击确定得到的才是字符串。我把取消判断放在编辑分支里，确认是字符串后才交给 updateTodo()。空字符串和纯空格则在 trim() 后统一拦住，并提示保留原内容。这样取消是结束操作，空输入是输入不合法，两个原因各有自己的处理位置。</w:t>
+      </w:r>
+    </w:p>
+    <w:p>
+      <w:pPr>
+        <w:keepNext/>
+        <w:keepLines/>
+        <w:pageBreakBefore w:val="0"/>
+        <w:spacing w:before="0" w:after="0" w:line="252" w:lineRule="auto"/>
+        <w:ind w:leftChars="800"/>
+        <w:rPr>
+          <w:rFonts w:hint="default" w:ascii="Times New Roman" w:hAnsi="Times New Roman" w:cs="Times New Roman"/>
+        </w:rPr>
+      </w:pPr>
+      <w:r>
+        <w:rPr>
+          <w:rFonts w:hint="default" w:ascii="Times New Roman" w:hAnsi="Times New Roman" w:eastAsia="宋体" w:cs="Times New Roman"/>
+          <w:b w:val="0"/>
+          <w:color w:val="000000"/>
+          <w:sz w:val="19"/>
+        </w:rPr>
+        <w:t>// updateTodo() 的核心部分，提示与焦点恢复代码略</w:t>
+      </w:r>
+    </w:p>
+    <w:p>
+      <w:pPr>
+        <w:keepNext/>
+        <w:keepLines/>
+        <w:pageBreakBefore w:val="0"/>
+        <w:spacing w:before="0" w:after="0" w:line="252" w:lineRule="auto"/>
+        <w:ind w:leftChars="800"/>
+        <w:rPr>
+          <w:rFonts w:hint="default" w:ascii="Times New Roman" w:hAnsi="Times New Roman" w:cs="Times New Roman"/>
+        </w:rPr>
+      </w:pPr>
+      <w:r>
+        <w:rPr>
+          <w:rFonts w:hint="default" w:ascii="Times New Roman" w:hAnsi="Times New Roman" w:eastAsia="宋体" w:cs="Times New Roman"/>
+          <w:b w:val="0"/>
+          <w:color w:val="000000"/>
+          <w:sz w:val="19"/>
+        </w:rPr>
+        <w:t>function updateTodo(id, text) {</w:t>
+      </w:r>
+    </w:p>
+    <w:p>
+      <w:pPr>
+        <w:keepNext/>
+        <w:keepLines/>
+        <w:pageBreakBefore w:val="0"/>
+        <w:spacing w:before="0" w:after="0" w:line="252" w:lineRule="auto"/>
+        <w:ind w:leftChars="800"/>
+        <w:rPr>
+          <w:rFonts w:hint="default" w:ascii="Times New Roman" w:hAnsi="Times New Roman" w:cs="Times New Roman"/>
+        </w:rPr>
+      </w:pPr>
+      <w:r>
+        <w:rPr>
+          <w:rFonts w:hint="default" w:ascii="Times New Roman" w:hAnsi="Times New Roman" w:eastAsia="宋体" w:cs="Times New Roman"/>
+          <w:b w:val="0"/>
+          <w:color w:val="000000"/>
+          <w:sz w:val="19"/>
+        </w:rPr>
+        <w:t xml:space="preserve">    const current = todos.find(todo =&gt; todo.id === id);</w:t>
+      </w:r>
+    </w:p>
+    <w:p>
+      <w:pPr>
+        <w:keepNext/>
+        <w:keepLines/>
+        <w:pageBreakBefore w:val="0"/>
+        <w:spacing w:before="0" w:after="0" w:line="252" w:lineRule="auto"/>
+        <w:ind w:leftChars="800"/>
+        <w:rPr>
+          <w:rFonts w:hint="default" w:ascii="Times New Roman" w:hAnsi="Times New Roman" w:cs="Times New Roman"/>
+        </w:rPr>
+      </w:pPr>
+      <w:r>
+        <w:rPr>
+          <w:rFonts w:hint="default" w:ascii="Times New Roman" w:hAnsi="Times New Roman" w:eastAsia="宋体" w:cs="Times New Roman"/>
+          <w:b w:val="0"/>
+          <w:color w:val="000000"/>
+          <w:sz w:val="19"/>
+        </w:rPr>
+        <w:t xml:space="preserve">    if (!current) return;</w:t>
+      </w:r>
+    </w:p>
+    <w:p>
+      <w:pPr>
+        <w:keepNext/>
+        <w:keepLines/>
+        <w:pageBreakBefore w:val="0"/>
+        <w:spacing w:before="0" w:after="0" w:line="252" w:lineRule="auto"/>
+        <w:ind w:leftChars="800"/>
+        <w:rPr>
+          <w:rFonts w:hint="default" w:ascii="Times New Roman" w:hAnsi="Times New Roman" w:cs="Times New Roman"/>
+        </w:rPr>
+      </w:pPr>
+      <w:r>
+        <w:rPr>
+          <w:rFonts w:hint="default" w:ascii="Times New Roman" w:hAnsi="Times New Roman" w:eastAsia="宋体" w:cs="Times New Roman"/>
+          <w:b w:val="0"/>
+          <w:color w:val="000000"/>
+          <w:sz w:val="19"/>
+        </w:rPr>
+        <w:t xml:space="preserve">    const value = text.trim();</w:t>
+      </w:r>
+    </w:p>
+    <w:p>
+      <w:pPr>
+        <w:keepNext/>
+        <w:keepLines/>
+        <w:pageBreakBefore w:val="0"/>
+        <w:spacing w:before="0" w:after="0" w:line="252" w:lineRule="auto"/>
+        <w:ind w:leftChars="800"/>
+        <w:rPr>
+          <w:rFonts w:hint="default" w:ascii="Times New Roman" w:hAnsi="Times New Roman" w:cs="Times New Roman"/>
+        </w:rPr>
+      </w:pPr>
+      <w:r>
+        <w:rPr>
+          <w:rFonts w:hint="default" w:ascii="Times New Roman" w:hAnsi="Times New Roman" w:eastAsia="宋体" w:cs="Times New Roman"/>
+          <w:b w:val="0"/>
+          <w:color w:val="000000"/>
+          <w:sz w:val="19"/>
+        </w:rPr>
+        <w:t xml:space="preserve">    if (value === '') {</w:t>
+      </w:r>
+    </w:p>
+    <w:p>
+      <w:pPr>
+        <w:keepNext/>
+        <w:keepLines/>
+        <w:pageBreakBefore w:val="0"/>
+        <w:spacing w:before="0" w:after="0" w:line="252" w:lineRule="auto"/>
+        <w:ind w:leftChars="800"/>
+        <w:rPr>
+          <w:rFonts w:hint="default" w:ascii="Times New Roman" w:hAnsi="Times New Roman" w:cs="Times New Roman"/>
+        </w:rPr>
+      </w:pPr>
+      <w:r>
+        <w:rPr>
+          <w:rFonts w:hint="default" w:ascii="Times New Roman" w:hAnsi="Times New Roman" w:eastAsia="宋体" w:cs="Times New Roman"/>
+          <w:b w:val="0"/>
+          <w:color w:val="000000"/>
+          <w:sz w:val="19"/>
+        </w:rPr>
+        <w:t xml:space="preserve">        message.textContent = '任务内容不能为空，已保留原内容。';</w:t>
+      </w:r>
+    </w:p>
+    <w:p>
+      <w:pPr>
+        <w:keepNext/>
+        <w:keepLines/>
+        <w:pageBreakBefore w:val="0"/>
+        <w:spacing w:before="0" w:after="0" w:line="252" w:lineRule="auto"/>
+        <w:ind w:leftChars="800"/>
+        <w:rPr>
+          <w:rFonts w:hint="default" w:ascii="Times New Roman" w:hAnsi="Times New Roman" w:cs="Times New Roman"/>
+        </w:rPr>
+      </w:pPr>
+      <w:r>
+        <w:rPr>
+          <w:rFonts w:hint="default" w:ascii="Times New Roman" w:hAnsi="Times New Roman" w:eastAsia="宋体" w:cs="Times New Roman"/>
+          <w:b w:val="0"/>
+          <w:color w:val="000000"/>
+          <w:sz w:val="19"/>
+        </w:rPr>
+        <w:t xml:space="preserve">        return;</w:t>
+      </w:r>
+    </w:p>
+    <w:p>
+      <w:pPr>
+        <w:keepNext w:val="0"/>
+        <w:keepLines/>
+        <w:pageBreakBefore w:val="0"/>
+        <w:spacing w:before="0" w:after="0" w:line="252" w:lineRule="auto"/>
+        <w:ind w:leftChars="800"/>
+        <w:rPr>
+          <w:rFonts w:hint="default" w:ascii="Times New Roman" w:hAnsi="Times New Roman" w:cs="Times New Roman"/>
+        </w:rPr>
+      </w:pPr>
+      <w:r>
+        <w:rPr>
+          <w:rFonts w:hint="default" w:ascii="Times New Roman" w:hAnsi="Times New Roman" w:eastAsia="宋体" w:cs="Times New Roman"/>
+          <w:b w:val="0"/>
+          <w:color w:val="000000"/>
+          <w:sz w:val="19"/>
+        </w:rPr>
+        <w:t xml:space="preserve">    }</w:t>
+      </w:r>
+    </w:p>
+    <w:p>
+      <w:pPr>
+        <w:keepNext w:val="0"/>
+        <w:keepLines/>
+        <w:pageBreakBefore w:val="0"/>
+        <w:spacing w:before="0" w:after="0" w:line="252" w:lineRule="auto"/>
+        <w:ind w:leftChars="800"/>
+        <w:rPr>
+          <w:rFonts w:hint="default" w:ascii="Times New Roman" w:hAnsi="Times New Roman" w:cs="Times New Roman"/>
+        </w:rPr>
+      </w:pPr>
+    </w:p>
+    <w:p>
+      <w:pPr>
+        <w:keepNext/>
+        <w:keepLines/>
+        <w:pageBreakBefore w:val="0"/>
+        <w:spacing w:before="0" w:after="0" w:line="252" w:lineRule="auto"/>
+        <w:ind w:leftChars="800"/>
+        <w:rPr>
+          <w:rFonts w:hint="default" w:ascii="Times New Roman" w:hAnsi="Times New Roman" w:cs="Times New Roman"/>
+        </w:rPr>
       </w:pPr>
       <w:r>
         <w:rPr>
@@ -3279,7 +4027,16 @@
           <w:color w:val="000000"/>
           <w:sz w:val="19"/>
         </w:rPr>
-        <w:t>// render() 中创建编辑按钮，后续只追加节点</w:t>
+        <w:t xml:space="preserve"> </w:t>
+      </w:r>
+      <w:r>
+        <w:rPr>
+          <w:rFonts w:hint="default" w:ascii="Times New Roman" w:hAnsi="Times New Roman" w:eastAsia="宋体" w:cs="Times New Roman"/>
+          <w:b w:val="0"/>
+          <w:color w:val="000000"/>
+          <w:sz w:val="19"/>
+        </w:rPr>
+        <w:t xml:space="preserve">   if (value === current.text) {</w:t>
       </w:r>
     </w:p>
     <w:p>
@@ -3287,16 +4044,20 @@
         <w:keepNext/>
         <w:keepLines/>
         <w:pageBreakBefore w:val="0"/>
-        <w:spacing w:after="0" w:line="252" w:lineRule="auto" w:before="0"/>
+        <w:spacing w:before="0" w:after="0" w:line="252" w:lineRule="auto"/>
+        <w:ind w:leftChars="800"/>
+        <w:rPr>
+          <w:rFonts w:hint="default" w:ascii="Times New Roman" w:hAnsi="Times New Roman" w:cs="Times New Roman"/>
+        </w:rPr>
       </w:pPr>
       <w:r>
         <w:rPr>
-          <w:rFonts w:ascii="Consolas" w:hAnsi="Consolas" w:eastAsia="宋体"/>
+          <w:rFonts w:hint="default" w:ascii="Times New Roman" w:hAnsi="Times New Roman" w:eastAsia="宋体" w:cs="Times New Roman"/>
           <w:b w:val="0"/>
           <w:color w:val="000000"/>
           <w:sz w:val="19"/>
         </w:rPr>
-        <w:t>const edit = document.createElement('button');</w:t>
+        <w:t xml:space="preserve">        message.textContent = '内容没有变化，已保留原任务。';</w:t>
       </w:r>
     </w:p>
     <w:p>
@@ -3304,16 +4065,20 @@
         <w:keepNext/>
         <w:keepLines/>
         <w:pageBreakBefore w:val="0"/>
-        <w:spacing w:after="0" w:line="252" w:lineRule="auto" w:before="0"/>
+        <w:spacing w:before="0" w:after="0" w:line="252" w:lineRule="auto"/>
+        <w:ind w:leftChars="800"/>
+        <w:rPr>
+          <w:rFonts w:hint="default" w:ascii="Times New Roman" w:hAnsi="Times New Roman" w:cs="Times New Roman"/>
+        </w:rPr>
       </w:pPr>
       <w:r>
         <w:rPr>
-          <w:rFonts w:ascii="Consolas" w:hAnsi="Consolas" w:eastAsia="宋体"/>
+          <w:rFonts w:hint="default" w:ascii="Times New Roman" w:hAnsi="Times New Roman" w:eastAsia="宋体" w:cs="Times New Roman"/>
           <w:b w:val="0"/>
           <w:color w:val="000000"/>
           <w:sz w:val="19"/>
         </w:rPr>
-        <w:t>edit.type = 'button';</w:t>
+        <w:t xml:space="preserve">        return;</w:t>
       </w:r>
     </w:p>
     <w:p>
@@ -3321,332 +4086,183 @@
         <w:keepNext/>
         <w:keepLines/>
         <w:pageBreakBefore w:val="0"/>
-        <w:spacing w:after="0" w:line="252" w:lineRule="auto" w:before="0"/>
+        <w:spacing w:before="0" w:after="0" w:line="252" w:lineRule="auto"/>
+        <w:ind w:leftChars="800"/>
+        <w:rPr>
+          <w:rFonts w:hint="default" w:ascii="Times New Roman" w:hAnsi="Times New Roman" w:cs="Times New Roman"/>
+        </w:rPr>
       </w:pPr>
       <w:r>
         <w:rPr>
-          <w:rFonts w:ascii="Consolas" w:hAnsi="Consolas" w:eastAsia="宋体"/>
+          <w:rFonts w:hint="default" w:ascii="Times New Roman" w:hAnsi="Times New Roman" w:eastAsia="宋体" w:cs="Times New Roman"/>
           <w:b w:val="0"/>
           <w:color w:val="000000"/>
           <w:sz w:val="19"/>
         </w:rPr>
-        <w:t>edit.dataset.action = 'edit';</w:t>
+        <w:t xml:space="preserve">    }</w:t>
       </w:r>
     </w:p>
     <w:p>
       <w:pPr>
+        <w:keepNext/>
+        <w:keepLines/>
+        <w:pageBreakBefore w:val="0"/>
+        <w:spacing w:before="0" w:after="0" w:line="252" w:lineRule="auto"/>
+        <w:ind w:leftChars="800"/>
+        <w:rPr>
+          <w:rFonts w:hint="default" w:ascii="Times New Roman" w:hAnsi="Times New Roman" w:cs="Times New Roman"/>
+        </w:rPr>
+      </w:pPr>
+      <w:r>
+        <w:rPr>
+          <w:rFonts w:hint="default" w:ascii="Times New Roman" w:hAnsi="Times New Roman" w:eastAsia="宋体" w:cs="Times New Roman"/>
+          <w:b w:val="0"/>
+          <w:color w:val="000000"/>
+          <w:sz w:val="19"/>
+        </w:rPr>
+        <w:t xml:space="preserve">    console.log('[edit]', id, value);</w:t>
+      </w:r>
+    </w:p>
+    <w:p>
+      <w:pPr>
+        <w:keepNext/>
+        <w:keepLines/>
+        <w:pageBreakBefore w:val="0"/>
+        <w:spacing w:before="0" w:after="0" w:line="252" w:lineRule="auto"/>
+        <w:ind w:leftChars="800"/>
+        <w:rPr>
+          <w:rFonts w:hint="default" w:ascii="Times New Roman" w:hAnsi="Times New Roman" w:cs="Times New Roman"/>
+        </w:rPr>
+      </w:pPr>
+      <w:r>
+        <w:rPr>
+          <w:rFonts w:hint="default" w:ascii="Times New Roman" w:hAnsi="Times New Roman" w:eastAsia="宋体" w:cs="Times New Roman"/>
+          <w:b w:val="0"/>
+          <w:color w:val="000000"/>
+          <w:sz w:val="19"/>
+        </w:rPr>
+        <w:t xml:space="preserve">    todos = todos.map(todo =&gt; todo.id === id</w:t>
+      </w:r>
+    </w:p>
+    <w:p>
+      <w:pPr>
+        <w:keepNext/>
+        <w:keepLines/>
+        <w:pageBreakBefore w:val="0"/>
+        <w:spacing w:before="0" w:after="0" w:line="252" w:lineRule="auto"/>
+        <w:ind w:leftChars="800"/>
+        <w:rPr>
+          <w:rFonts w:hint="default" w:ascii="Times New Roman" w:hAnsi="Times New Roman" w:cs="Times New Roman"/>
+        </w:rPr>
+      </w:pPr>
+      <w:r>
+        <w:rPr>
+          <w:rFonts w:hint="default" w:ascii="Times New Roman" w:hAnsi="Times New Roman" w:eastAsia="宋体" w:cs="Times New Roman"/>
+          <w:b w:val="0"/>
+          <w:color w:val="000000"/>
+          <w:sz w:val="19"/>
+        </w:rPr>
+        <w:t xml:space="preserve">        ? { ...todo, text: value }</w:t>
+      </w:r>
+    </w:p>
+    <w:p>
+      <w:pPr>
+        <w:keepNext/>
+        <w:keepLines/>
+        <w:pageBreakBefore w:val="0"/>
+        <w:spacing w:before="0" w:after="0" w:line="252" w:lineRule="auto"/>
+        <w:ind w:leftChars="800"/>
+        <w:rPr>
+          <w:rFonts w:hint="default" w:ascii="Times New Roman" w:hAnsi="Times New Roman" w:cs="Times New Roman"/>
+        </w:rPr>
+      </w:pPr>
+      <w:r>
+        <w:rPr>
+          <w:rFonts w:hint="default" w:ascii="Times New Roman" w:hAnsi="Times New Roman" w:eastAsia="宋体" w:cs="Times New Roman"/>
+          <w:b w:val="0"/>
+          <w:color w:val="000000"/>
+          <w:sz w:val="19"/>
+        </w:rPr>
+        <w:t xml:space="preserve">        : todo);</w:t>
+      </w:r>
+    </w:p>
+    <w:p>
+      <w:pPr>
+        <w:keepNext/>
+        <w:keepLines/>
+        <w:pageBreakBefore w:val="0"/>
+        <w:spacing w:before="0" w:after="0" w:line="252" w:lineRule="auto"/>
+        <w:ind w:leftChars="800"/>
+        <w:rPr>
+          <w:rFonts w:hint="default" w:ascii="Times New Roman" w:hAnsi="Times New Roman" w:cs="Times New Roman"/>
+        </w:rPr>
+      </w:pPr>
+      <w:r>
+        <w:rPr>
+          <w:rFonts w:hint="default" w:ascii="Times New Roman" w:hAnsi="Times New Roman" w:eastAsia="宋体" w:cs="Times New Roman"/>
+          <w:b w:val="0"/>
+          <w:color w:val="000000"/>
+          <w:sz w:val="19"/>
+        </w:rPr>
+        <w:t xml:space="preserve">    const saved = save();</w:t>
+      </w:r>
+    </w:p>
+    <w:p>
+      <w:pPr>
+        <w:keepNext/>
+        <w:keepLines/>
+        <w:pageBreakBefore w:val="0"/>
+        <w:spacing w:before="0" w:after="0" w:line="252" w:lineRule="auto"/>
+        <w:ind w:leftChars="800"/>
+        <w:rPr>
+          <w:rFonts w:hint="default" w:ascii="Times New Roman" w:hAnsi="Times New Roman" w:cs="Times New Roman"/>
+        </w:rPr>
+      </w:pPr>
+      <w:r>
+        <w:rPr>
+          <w:rFonts w:hint="default" w:ascii="Times New Roman" w:hAnsi="Times New Roman" w:eastAsia="宋体" w:cs="Times New Roman"/>
+          <w:b w:val="0"/>
+          <w:color w:val="000000"/>
+          <w:sz w:val="19"/>
+        </w:rPr>
+        <w:t xml:space="preserve">    render();</w:t>
+      </w:r>
+    </w:p>
+    <w:p>
+      <w:pPr>
+        <w:keepNext/>
+        <w:keepLines/>
+        <w:pageBreakBefore w:val="0"/>
+        <w:spacing w:before="0" w:after="0" w:line="252" w:lineRule="auto"/>
+        <w:ind w:leftChars="800"/>
+        <w:rPr>
+          <w:rFonts w:hint="default" w:ascii="Times New Roman" w:hAnsi="Times New Roman" w:cs="Times New Roman"/>
+        </w:rPr>
+      </w:pPr>
+      <w:r>
+        <w:rPr>
+          <w:rFonts w:hint="default" w:ascii="Times New Roman" w:hAnsi="Times New Roman" w:eastAsia="宋体" w:cs="Times New Roman"/>
+          <w:b w:val="0"/>
+          <w:color w:val="000000"/>
+          <w:sz w:val="19"/>
+        </w:rPr>
+        <w:t xml:space="preserve">    // 完整函数根据 saved 提示结果，再恢复编辑按钮焦点</w:t>
+      </w:r>
+    </w:p>
+    <w:p>
+      <w:pPr>
         <w:keepNext w:val="0"/>
         <w:keepLines/>
         <w:pageBreakBefore w:val="0"/>
-        <w:spacing w:after="0" w:line="252" w:lineRule="auto" w:before="0"/>
+        <w:spacing w:before="0" w:after="120" w:line="252" w:lineRule="auto"/>
+        <w:ind w:leftChars="800"/>
+        <w:rPr>
+          <w:rFonts w:hint="default" w:ascii="Times New Roman" w:hAnsi="Times New Roman" w:cs="Times New Roman"/>
+        </w:rPr>
       </w:pPr>
       <w:r>
         <w:rPr>
-          <w:rFonts w:ascii="Consolas" w:hAnsi="Consolas" w:eastAsia="宋体"/>
-          <w:b w:val="0"/>
-          <w:color w:val="000000"/>
-          <w:sz w:val="19"/>
-        </w:rPr>
-        <w:t>// 原有代码继续设置文字并追加到 li</w:t>
-      </w:r>
-    </w:p>
-    <w:p>
-      <w:pPr>
-        <w:keepNext w:val="0"/>
-        <w:keepLines/>
-        <w:pageBreakBefore w:val="0"/>
-        <w:spacing w:after="0" w:line="252" w:lineRule="auto" w:before="0"/>
-      </w:pPr>
-      <w:r>
-        <w:rPr>
-          <w:rFonts w:ascii="Consolas" w:hAnsi="Consolas" w:eastAsia="宋体"/>
-          <w:b w:val="0"/>
-          <w:color w:val="000000"/>
-          <w:sz w:val="19"/>
-        </w:rPr>
-      </w:r>
-    </w:p>
-    <w:p>
-      <w:pPr>
-        <w:keepNext/>
-        <w:keepLines/>
-        <w:pageBreakBefore w:val="0"/>
-        <w:spacing w:after="0" w:line="252" w:lineRule="auto" w:before="0"/>
-      </w:pPr>
-      <w:r>
-        <w:rPr>
-          <w:rFonts w:ascii="Consolas" w:hAnsi="Consolas" w:eastAsia="宋体"/>
-          <w:b w:val="0"/>
-          <w:color w:val="000000"/>
-          <w:sz w:val="19"/>
-        </w:rPr>
-        <w:t>// handleListClick() 中，沿用前面的 li 和数字 id 检查</w:t>
-      </w:r>
-    </w:p>
-    <w:p>
-      <w:pPr>
-        <w:keepNext/>
-        <w:keepLines/>
-        <w:pageBreakBefore w:val="0"/>
-        <w:spacing w:after="0" w:line="252" w:lineRule="auto" w:before="0"/>
-      </w:pPr>
-      <w:r>
-        <w:rPr>
-          <w:rFonts w:ascii="Consolas" w:hAnsi="Consolas" w:eastAsia="宋体"/>
-          <w:b w:val="0"/>
-          <w:color w:val="000000"/>
-          <w:sz w:val="19"/>
-        </w:rPr>
-        <w:t>const actionButton = e.target.closest('button[data-action]');</w:t>
-      </w:r>
-    </w:p>
-    <w:p>
-      <w:pPr>
-        <w:keepNext/>
-        <w:keepLines/>
-        <w:pageBreakBefore w:val="0"/>
-        <w:spacing w:after="0" w:line="252" w:lineRule="auto" w:before="0"/>
-      </w:pPr>
-      <w:r>
-        <w:rPr>
-          <w:rFonts w:ascii="Consolas" w:hAnsi="Consolas" w:eastAsia="宋体"/>
-          <w:b w:val="0"/>
-          <w:color w:val="000000"/>
-          <w:sz w:val="19"/>
-        </w:rPr>
-        <w:t>if (actionButton &amp;&amp; !item.contains(actionButton)) return;</w:t>
-      </w:r>
-    </w:p>
-    <w:p>
-      <w:pPr>
-        <w:keepNext w:val="0"/>
-        <w:keepLines/>
-        <w:pageBreakBefore w:val="0"/>
-        <w:spacing w:after="0" w:line="252" w:lineRule="auto" w:before="0"/>
-      </w:pPr>
-      <w:r>
-        <w:rPr>
-          <w:rFonts w:ascii="Consolas" w:hAnsi="Consolas" w:eastAsia="宋体"/>
-          <w:b w:val="0"/>
-          <w:color w:val="000000"/>
-          <w:sz w:val="19"/>
-        </w:rPr>
-        <w:t>const action = actionButton ? actionButton.dataset.action : null;</w:t>
-      </w:r>
-    </w:p>
-    <w:p>
-      <w:pPr>
-        <w:keepNext w:val="0"/>
-        <w:keepLines/>
-        <w:pageBreakBefore w:val="0"/>
-        <w:spacing w:after="0" w:line="252" w:lineRule="auto" w:before="0"/>
-      </w:pPr>
-      <w:r>
-        <w:rPr>
-          <w:rFonts w:ascii="Consolas" w:hAnsi="Consolas" w:eastAsia="宋体"/>
-          <w:b w:val="0"/>
-          <w:color w:val="000000"/>
-          <w:sz w:val="19"/>
-        </w:rPr>
-      </w:r>
-    </w:p>
-    <w:p>
-      <w:pPr>
-        <w:keepNext/>
-        <w:keepLines/>
-        <w:pageBreakBefore w:val="0"/>
-        <w:spacing w:after="0" w:line="252" w:lineRule="auto" w:before="0"/>
-      </w:pPr>
-      <w:r>
-        <w:rPr>
-          <w:rFonts w:ascii="Consolas" w:hAnsi="Consolas" w:eastAsia="宋体"/>
-          <w:b w:val="0"/>
-          <w:color w:val="000000"/>
-          <w:sz w:val="19"/>
-        </w:rPr>
-        <w:t>if (action === 'delete') {</w:t>
-      </w:r>
-    </w:p>
-    <w:p>
-      <w:pPr>
-        <w:keepNext/>
-        <w:keepLines/>
-        <w:pageBreakBefore w:val="0"/>
-        <w:spacing w:after="0" w:line="252" w:lineRule="auto" w:before="0"/>
-      </w:pPr>
-      <w:r>
-        <w:rPr>
-          <w:rFonts w:ascii="Consolas" w:hAnsi="Consolas" w:eastAsia="宋体"/>
-          <w:b w:val="0"/>
-          <w:color w:val="000000"/>
-          <w:sz w:val="19"/>
-        </w:rPr>
-        <w:t xml:space="preserve">    deleteTodo(id);</w:t>
-      </w:r>
-    </w:p>
-    <w:p>
-      <w:pPr>
-        <w:keepNext/>
-        <w:keepLines/>
-        <w:pageBreakBefore w:val="0"/>
-        <w:spacing w:after="0" w:line="252" w:lineRule="auto" w:before="0"/>
-      </w:pPr>
-      <w:r>
-        <w:rPr>
-          <w:rFonts w:ascii="Consolas" w:hAnsi="Consolas" w:eastAsia="宋体"/>
-          <w:b w:val="0"/>
-          <w:color w:val="000000"/>
-          <w:sz w:val="19"/>
-        </w:rPr>
-        <w:t>} else if (action === 'edit') {</w:t>
-      </w:r>
-    </w:p>
-    <w:p>
-      <w:pPr>
-        <w:keepNext/>
-        <w:keepLines/>
-        <w:pageBreakBefore w:val="0"/>
-        <w:spacing w:after="0" w:line="252" w:lineRule="auto" w:before="0"/>
-      </w:pPr>
-      <w:r>
-        <w:rPr>
-          <w:rFonts w:ascii="Consolas" w:hAnsi="Consolas" w:eastAsia="宋体"/>
-          <w:b w:val="0"/>
-          <w:color w:val="000000"/>
-          <w:sz w:val="19"/>
-        </w:rPr>
-        <w:t xml:space="preserve">    const todo = todos.find(todo =&gt; todo.id === id);</w:t>
-      </w:r>
-    </w:p>
-    <w:p>
-      <w:pPr>
-        <w:keepNext/>
-        <w:keepLines/>
-        <w:pageBreakBefore w:val="0"/>
-        <w:spacing w:after="0" w:line="252" w:lineRule="auto" w:before="0"/>
-      </w:pPr>
-      <w:r>
-        <w:rPr>
-          <w:rFonts w:ascii="Consolas" w:hAnsi="Consolas" w:eastAsia="宋体"/>
-          <w:b w:val="0"/>
-          <w:color w:val="000000"/>
-          <w:sz w:val="19"/>
-        </w:rPr>
-        <w:t xml:space="preserve">    const text = window.prompt('修改任务', todo.text);</w:t>
-      </w:r>
-    </w:p>
-    <w:p>
-      <w:pPr>
-        <w:keepNext/>
-        <w:keepLines/>
-        <w:pageBreakBefore w:val="0"/>
-        <w:spacing w:after="0" w:line="252" w:lineRule="auto" w:before="0"/>
-      </w:pPr>
-      <w:r>
-        <w:rPr>
-          <w:rFonts w:ascii="Consolas" w:hAnsi="Consolas" w:eastAsia="宋体"/>
-          <w:b w:val="0"/>
-          <w:color w:val="000000"/>
-          <w:sz w:val="19"/>
-        </w:rPr>
-        <w:t xml:space="preserve">    if (text === null) return;</w:t>
-      </w:r>
-    </w:p>
-    <w:p>
-      <w:pPr>
-        <w:keepNext/>
-        <w:keepLines/>
-        <w:pageBreakBefore w:val="0"/>
-        <w:spacing w:after="0" w:line="252" w:lineRule="auto" w:before="0"/>
-      </w:pPr>
-      <w:r>
-        <w:rPr>
-          <w:rFonts w:ascii="Consolas" w:hAnsi="Consolas" w:eastAsia="宋体"/>
-          <w:b w:val="0"/>
-          <w:color w:val="000000"/>
-          <w:sz w:val="19"/>
-        </w:rPr>
-        <w:t xml:space="preserve">    updateTodo(id, text);</w:t>
-      </w:r>
-    </w:p>
-    <w:p>
-      <w:pPr>
-        <w:keepNext/>
-        <w:keepLines/>
-        <w:pageBreakBefore w:val="0"/>
-        <w:spacing w:after="0" w:line="252" w:lineRule="auto" w:before="0"/>
-      </w:pPr>
-      <w:r>
-        <w:rPr>
-          <w:rFonts w:ascii="Consolas" w:hAnsi="Consolas" w:eastAsia="宋体"/>
-          <w:b w:val="0"/>
-          <w:color w:val="000000"/>
-          <w:sz w:val="19"/>
-        </w:rPr>
-        <w:t>} else {</w:t>
-      </w:r>
-    </w:p>
-    <w:p>
-      <w:pPr>
-        <w:keepNext/>
-        <w:keepLines/>
-        <w:pageBreakBefore w:val="0"/>
-        <w:spacing w:after="0" w:line="252" w:lineRule="auto" w:before="0"/>
-      </w:pPr>
-      <w:r>
-        <w:rPr>
-          <w:rFonts w:ascii="Consolas" w:hAnsi="Consolas" w:eastAsia="宋体"/>
-          <w:b w:val="0"/>
-          <w:color w:val="000000"/>
-          <w:sz w:val="19"/>
-        </w:rPr>
-        <w:t xml:space="preserve">    if (actionButton) return;</w:t>
-      </w:r>
-    </w:p>
-    <w:p>
-      <w:pPr>
-        <w:keepNext/>
-        <w:keepLines/>
-        <w:pageBreakBefore w:val="0"/>
-        <w:spacing w:after="0" w:line="252" w:lineRule="auto" w:before="0"/>
-      </w:pPr>
-      <w:r>
-        <w:rPr>
-          <w:rFonts w:ascii="Consolas" w:hAnsi="Consolas" w:eastAsia="宋体"/>
-          <w:b w:val="0"/>
-          <w:color w:val="000000"/>
-          <w:sz w:val="19"/>
-        </w:rPr>
-        <w:t xml:space="preserve">    if (e.target.matches('input[type="checkbox"]')) e.preventDefault();</w:t>
-      </w:r>
-    </w:p>
-    <w:p>
-      <w:pPr>
-        <w:keepNext/>
-        <w:keepLines/>
-        <w:pageBreakBefore w:val="0"/>
-        <w:spacing w:after="0" w:line="252" w:lineRule="auto" w:before="0"/>
-      </w:pPr>
-      <w:r>
-        <w:rPr>
-          <w:rFonts w:ascii="Consolas" w:hAnsi="Consolas" w:eastAsia="宋体"/>
-          <w:b w:val="0"/>
-          <w:color w:val="000000"/>
-          <w:sz w:val="19"/>
-        </w:rPr>
-        <w:t xml:space="preserve">    toggleTodo(id);</w:t>
-      </w:r>
-    </w:p>
-    <w:p>
-      <w:pPr>
-        <w:keepNext w:val="0"/>
-        <w:keepLines/>
-        <w:pageBreakBefore w:val="0"/>
-        <w:spacing w:after="120" w:line="252" w:lineRule="auto" w:before="0"/>
-      </w:pPr>
-      <w:r>
-        <w:rPr>
-          <w:rFonts w:ascii="Consolas" w:hAnsi="Consolas" w:eastAsia="宋体"/>
+          <w:rFonts w:hint="default" w:ascii="Times New Roman" w:hAnsi="Times New Roman" w:eastAsia="宋体" w:cs="Times New Roman"/>
           <w:b w:val="0"/>
           <w:color w:val="000000"/>
           <w:sz w:val="19"/>
@@ -3671,7 +4287,7 @@
           <w:color w:val="000000"/>
           <w:sz w:val="21"/>
         </w:rPr>
-        <w:t>取原文字是迁移时需要想清楚的一步。以前逐项绑定回调时，可以直接用循环里的任务变量；现在监听器放在 ul 上，回调里只先拿到事件和 id。我不能把渲染循环里的变量直接搬进来，而是先用 todos.find() 找到当前任务，再把 todo.text 放进输入框。这里的 id 已经由 Number(item.dataset.id) 转成数字，并检查过任务存在，才能和第七周保存的数字 id 对上。</w:t>
+        <w:t>为了分清这两个容易照搬出错的地方，我单独运行了两个反例：在没有定义 t 的父回调环境里读取 t.text，得到 ReferenceError；对取消得到的 null 调用 trim()，得到 TypeError。这是主动做的对照检查。最后的代码先按 id 找任务、先拦住 null，没有把这两个反例放进应用。对输入后内容没有变化的情况，我也提前结束，避免没有实质修改却重复保存和重画。</w:t>
       </w:r>
     </w:p>
     <w:p>
@@ -3691,7 +4307,7 @@
           <w:color w:val="000000"/>
           <w:sz w:val="21"/>
         </w:rPr>
-        <w:t>2. 把取消、空输入和有效修改分开</w:t>
+        <w:t>3. 改文字时保留原状态，再检查数据和界面</w:t>
       </w:r>
     </w:p>
     <w:p>
@@ -3711,380 +4327,7 @@
           <w:color w:val="000000"/>
           <w:sz w:val="21"/>
         </w:rPr>
-        <w:t>输入判断不能只看“有没有新文字”。点取消时 prompt() 返回 null，直接 trim() 会报错；点击确定得到的才是字符串。我把取消判断放在编辑分支里，确认是字符串后才交给 updateTodo()。空字符串和纯空格则在 trim() 后统一拦住，并提示保留原内容。这样取消是结束操作，空输入是输入不合法，两个原因各有自己的处理位置。</w:t>
-      </w:r>
-    </w:p>
-    <w:p>
-      <w:pPr>
-        <w:keepNext/>
-        <w:keepLines/>
-        <w:pageBreakBefore w:val="0"/>
-        <w:spacing w:after="0" w:line="252" w:lineRule="auto" w:before="0"/>
-      </w:pPr>
-      <w:r>
-        <w:rPr>
-          <w:rFonts w:ascii="Consolas" w:hAnsi="Consolas" w:eastAsia="宋体"/>
-          <w:b w:val="0"/>
-          <w:color w:val="000000"/>
-          <w:sz w:val="19"/>
-        </w:rPr>
-        <w:t>// updateTodo() 的核心部分，提示与焦点恢复代码略</w:t>
-      </w:r>
-    </w:p>
-    <w:p>
-      <w:pPr>
-        <w:keepNext/>
-        <w:keepLines/>
-        <w:pageBreakBefore w:val="0"/>
-        <w:spacing w:after="0" w:line="252" w:lineRule="auto" w:before="0"/>
-      </w:pPr>
-      <w:r>
-        <w:rPr>
-          <w:rFonts w:ascii="Consolas" w:hAnsi="Consolas" w:eastAsia="宋体"/>
-          <w:b w:val="0"/>
-          <w:color w:val="000000"/>
-          <w:sz w:val="19"/>
-        </w:rPr>
-        <w:t>function updateTodo(id, text) {</w:t>
-      </w:r>
-    </w:p>
-    <w:p>
-      <w:pPr>
-        <w:keepNext/>
-        <w:keepLines/>
-        <w:pageBreakBefore w:val="0"/>
-        <w:spacing w:after="0" w:line="252" w:lineRule="auto" w:before="0"/>
-      </w:pPr>
-      <w:r>
-        <w:rPr>
-          <w:rFonts w:ascii="Consolas" w:hAnsi="Consolas" w:eastAsia="宋体"/>
-          <w:b w:val="0"/>
-          <w:color w:val="000000"/>
-          <w:sz w:val="19"/>
-        </w:rPr>
-        <w:t xml:space="preserve">    const current = todos.find(todo =&gt; todo.id === id);</w:t>
-      </w:r>
-    </w:p>
-    <w:p>
-      <w:pPr>
-        <w:keepNext/>
-        <w:keepLines/>
-        <w:pageBreakBefore w:val="0"/>
-        <w:spacing w:after="0" w:line="252" w:lineRule="auto" w:before="0"/>
-      </w:pPr>
-      <w:r>
-        <w:rPr>
-          <w:rFonts w:ascii="Consolas" w:hAnsi="Consolas" w:eastAsia="宋体"/>
-          <w:b w:val="0"/>
-          <w:color w:val="000000"/>
-          <w:sz w:val="19"/>
-        </w:rPr>
-        <w:t xml:space="preserve">    if (!current) return;</w:t>
-      </w:r>
-    </w:p>
-    <w:p>
-      <w:pPr>
-        <w:keepNext/>
-        <w:keepLines/>
-        <w:pageBreakBefore w:val="0"/>
-        <w:spacing w:after="0" w:line="252" w:lineRule="auto" w:before="0"/>
-      </w:pPr>
-      <w:r>
-        <w:rPr>
-          <w:rFonts w:ascii="Consolas" w:hAnsi="Consolas" w:eastAsia="宋体"/>
-          <w:b w:val="0"/>
-          <w:color w:val="000000"/>
-          <w:sz w:val="19"/>
-        </w:rPr>
-        <w:t xml:space="preserve">    const value = text.trim();</w:t>
-      </w:r>
-    </w:p>
-    <w:p>
-      <w:pPr>
-        <w:keepNext/>
-        <w:keepLines/>
-        <w:pageBreakBefore w:val="0"/>
-        <w:spacing w:after="0" w:line="252" w:lineRule="auto" w:before="0"/>
-      </w:pPr>
-      <w:r>
-        <w:rPr>
-          <w:rFonts w:ascii="Consolas" w:hAnsi="Consolas" w:eastAsia="宋体"/>
-          <w:b w:val="0"/>
-          <w:color w:val="000000"/>
-          <w:sz w:val="19"/>
-        </w:rPr>
-        <w:t xml:space="preserve">    if (value === '') {</w:t>
-      </w:r>
-    </w:p>
-    <w:p>
-      <w:pPr>
-        <w:keepNext/>
-        <w:keepLines/>
-        <w:pageBreakBefore w:val="0"/>
-        <w:spacing w:after="0" w:line="252" w:lineRule="auto" w:before="0"/>
-      </w:pPr>
-      <w:r>
-        <w:rPr>
-          <w:rFonts w:ascii="Consolas" w:hAnsi="Consolas" w:eastAsia="宋体"/>
-          <w:b w:val="0"/>
-          <w:color w:val="000000"/>
-          <w:sz w:val="19"/>
-        </w:rPr>
-        <w:t xml:space="preserve">        message.textContent = '任务内容不能为空，已保留原内容。';</w:t>
-      </w:r>
-    </w:p>
-    <w:p>
-      <w:pPr>
-        <w:keepNext/>
-        <w:keepLines/>
-        <w:pageBreakBefore w:val="0"/>
-        <w:spacing w:after="0" w:line="252" w:lineRule="auto" w:before="0"/>
-      </w:pPr>
-      <w:r>
-        <w:rPr>
-          <w:rFonts w:ascii="Consolas" w:hAnsi="Consolas" w:eastAsia="宋体"/>
-          <w:b w:val="0"/>
-          <w:color w:val="000000"/>
-          <w:sz w:val="19"/>
-        </w:rPr>
-        <w:t xml:space="preserve">        return;</w:t>
-      </w:r>
-    </w:p>
-    <w:p>
-      <w:pPr>
-        <w:keepNext w:val="0"/>
-        <w:keepLines/>
-        <w:pageBreakBefore w:val="0"/>
-        <w:spacing w:after="0" w:line="252" w:lineRule="auto" w:before="0"/>
-      </w:pPr>
-      <w:r>
-        <w:rPr>
-          <w:rFonts w:ascii="Consolas" w:hAnsi="Consolas" w:eastAsia="宋体"/>
-          <w:b w:val="0"/>
-          <w:color w:val="000000"/>
-          <w:sz w:val="19"/>
-        </w:rPr>
-        <w:t xml:space="preserve">    }</w:t>
-      </w:r>
-    </w:p>
-    <w:p>
-      <w:pPr>
-        <w:keepNext w:val="0"/>
-        <w:keepLines/>
-        <w:pageBreakBefore w:val="0"/>
-        <w:spacing w:after="0" w:line="252" w:lineRule="auto" w:before="0"/>
-      </w:pPr>
-      <w:r>
-        <w:rPr>
-          <w:rFonts w:ascii="Consolas" w:hAnsi="Consolas" w:eastAsia="宋体"/>
-          <w:b w:val="0"/>
-          <w:color w:val="000000"/>
-          <w:sz w:val="19"/>
-        </w:rPr>
-      </w:r>
-    </w:p>
-    <w:p>
-      <w:pPr>
-        <w:keepNext/>
-        <w:keepLines/>
-        <w:pageBreakBefore w:val="0"/>
-        <w:spacing w:after="0" w:line="252" w:lineRule="auto" w:before="0"/>
-      </w:pPr>
-      <w:r>
-        <w:rPr>
-          <w:rFonts w:ascii="Consolas" w:hAnsi="Consolas" w:eastAsia="宋体"/>
-          <w:b w:val="0"/>
-          <w:color w:val="000000"/>
-          <w:sz w:val="19"/>
-        </w:rPr>
-        <w:t xml:space="preserve">    if (value === current.text) {</w:t>
-      </w:r>
-    </w:p>
-    <w:p>
-      <w:pPr>
-        <w:keepNext/>
-        <w:keepLines/>
-        <w:pageBreakBefore w:val="0"/>
-        <w:spacing w:after="0" w:line="252" w:lineRule="auto" w:before="0"/>
-      </w:pPr>
-      <w:r>
-        <w:rPr>
-          <w:rFonts w:ascii="Consolas" w:hAnsi="Consolas" w:eastAsia="宋体"/>
-          <w:b w:val="0"/>
-          <w:color w:val="000000"/>
-          <w:sz w:val="19"/>
-        </w:rPr>
-        <w:t xml:space="preserve">        message.textContent = '内容没有变化，已保留原任务。';</w:t>
-      </w:r>
-    </w:p>
-    <w:p>
-      <w:pPr>
-        <w:keepNext/>
-        <w:keepLines/>
-        <w:pageBreakBefore w:val="0"/>
-        <w:spacing w:after="0" w:line="252" w:lineRule="auto" w:before="0"/>
-      </w:pPr>
-      <w:r>
-        <w:rPr>
-          <w:rFonts w:ascii="Consolas" w:hAnsi="Consolas" w:eastAsia="宋体"/>
-          <w:b w:val="0"/>
-          <w:color w:val="000000"/>
-          <w:sz w:val="19"/>
-        </w:rPr>
-        <w:t xml:space="preserve">        return;</w:t>
-      </w:r>
-    </w:p>
-    <w:p>
-      <w:pPr>
-        <w:keepNext/>
-        <w:keepLines/>
-        <w:pageBreakBefore w:val="0"/>
-        <w:spacing w:after="0" w:line="252" w:lineRule="auto" w:before="0"/>
-      </w:pPr>
-      <w:r>
-        <w:rPr>
-          <w:rFonts w:ascii="Consolas" w:hAnsi="Consolas" w:eastAsia="宋体"/>
-          <w:b w:val="0"/>
-          <w:color w:val="000000"/>
-          <w:sz w:val="19"/>
-        </w:rPr>
-        <w:t xml:space="preserve">    }</w:t>
-      </w:r>
-    </w:p>
-    <w:p>
-      <w:pPr>
-        <w:keepNext/>
-        <w:keepLines/>
-        <w:pageBreakBefore w:val="0"/>
-        <w:spacing w:after="0" w:line="252" w:lineRule="auto" w:before="0"/>
-      </w:pPr>
-      <w:r>
-        <w:rPr>
-          <w:rFonts w:ascii="Consolas" w:hAnsi="Consolas" w:eastAsia="宋体"/>
-          <w:b w:val="0"/>
-          <w:color w:val="000000"/>
-          <w:sz w:val="19"/>
-        </w:rPr>
-        <w:t xml:space="preserve">    console.log('[edit]', id, value);</w:t>
-      </w:r>
-    </w:p>
-    <w:p>
-      <w:pPr>
-        <w:keepNext/>
-        <w:keepLines/>
-        <w:pageBreakBefore w:val="0"/>
-        <w:spacing w:after="0" w:line="252" w:lineRule="auto" w:before="0"/>
-      </w:pPr>
-      <w:r>
-        <w:rPr>
-          <w:rFonts w:ascii="Consolas" w:hAnsi="Consolas" w:eastAsia="宋体"/>
-          <w:b w:val="0"/>
-          <w:color w:val="000000"/>
-          <w:sz w:val="19"/>
-        </w:rPr>
-        <w:t xml:space="preserve">    todos = todos.map(todo =&gt; todo.id === id</w:t>
-      </w:r>
-    </w:p>
-    <w:p>
-      <w:pPr>
-        <w:keepNext/>
-        <w:keepLines/>
-        <w:pageBreakBefore w:val="0"/>
-        <w:spacing w:after="0" w:line="252" w:lineRule="auto" w:before="0"/>
-      </w:pPr>
-      <w:r>
-        <w:rPr>
-          <w:rFonts w:ascii="Consolas" w:hAnsi="Consolas" w:eastAsia="宋体"/>
-          <w:b w:val="0"/>
-          <w:color w:val="000000"/>
-          <w:sz w:val="19"/>
-        </w:rPr>
-        <w:t xml:space="preserve">        ? { ...todo, text: value }</w:t>
-      </w:r>
-    </w:p>
-    <w:p>
-      <w:pPr>
-        <w:keepNext/>
-        <w:keepLines/>
-        <w:pageBreakBefore w:val="0"/>
-        <w:spacing w:after="0" w:line="252" w:lineRule="auto" w:before="0"/>
-      </w:pPr>
-      <w:r>
-        <w:rPr>
-          <w:rFonts w:ascii="Consolas" w:hAnsi="Consolas" w:eastAsia="宋体"/>
-          <w:b w:val="0"/>
-          <w:color w:val="000000"/>
-          <w:sz w:val="19"/>
-        </w:rPr>
-        <w:t xml:space="preserve">        : todo);</w:t>
-      </w:r>
-    </w:p>
-    <w:p>
-      <w:pPr>
-        <w:keepNext/>
-        <w:keepLines/>
-        <w:pageBreakBefore w:val="0"/>
-        <w:spacing w:after="0" w:line="252" w:lineRule="auto" w:before="0"/>
-      </w:pPr>
-      <w:r>
-        <w:rPr>
-          <w:rFonts w:ascii="Consolas" w:hAnsi="Consolas" w:eastAsia="宋体"/>
-          <w:b w:val="0"/>
-          <w:color w:val="000000"/>
-          <w:sz w:val="19"/>
-        </w:rPr>
-        <w:t xml:space="preserve">    const saved = save();</w:t>
-      </w:r>
-    </w:p>
-    <w:p>
-      <w:pPr>
-        <w:keepNext/>
-        <w:keepLines/>
-        <w:pageBreakBefore w:val="0"/>
-        <w:spacing w:after="0" w:line="252" w:lineRule="auto" w:before="0"/>
-      </w:pPr>
-      <w:r>
-        <w:rPr>
-          <w:rFonts w:ascii="Consolas" w:hAnsi="Consolas" w:eastAsia="宋体"/>
-          <w:b w:val="0"/>
-          <w:color w:val="000000"/>
-          <w:sz w:val="19"/>
-        </w:rPr>
-        <w:t xml:space="preserve">    render();</w:t>
-      </w:r>
-    </w:p>
-    <w:p>
-      <w:pPr>
-        <w:keepNext/>
-        <w:keepLines/>
-        <w:pageBreakBefore w:val="0"/>
-        <w:spacing w:after="0" w:line="252" w:lineRule="auto" w:before="0"/>
-      </w:pPr>
-      <w:r>
-        <w:rPr>
-          <w:rFonts w:ascii="Consolas" w:hAnsi="Consolas" w:eastAsia="宋体"/>
-          <w:b w:val="0"/>
-          <w:color w:val="000000"/>
-          <w:sz w:val="19"/>
-        </w:rPr>
-        <w:t xml:space="preserve">    // 完整函数根据 saved 提示结果，再恢复编辑按钮焦点</w:t>
-      </w:r>
-    </w:p>
-    <w:p>
-      <w:pPr>
-        <w:keepNext w:val="0"/>
-        <w:keepLines/>
-        <w:pageBreakBefore w:val="0"/>
-        <w:spacing w:after="120" w:line="252" w:lineRule="auto" w:before="0"/>
-      </w:pPr>
-      <w:r>
-        <w:rPr>
-          <w:rFonts w:ascii="Consolas" w:hAnsi="Consolas" w:eastAsia="宋体"/>
-          <w:b w:val="0"/>
-          <w:color w:val="000000"/>
-          <w:sz w:val="19"/>
-        </w:rPr>
-        <w:t>}</w:t>
+        <w:t>我把真正的数据修改放在 updateTodo()，没有直接去改页面上的 span。map() 生成新数组，命中的任务用 { ...todo, text: value } 生成新对象，因此 id 和 completed 都保留下来，只替换 text；没有命中的任务仍返回原对象。随后 save() 保存完整 todos，render() 再根据当前筛选显示。这里要分清“页面现在显示了几条”和“完整数据有几条”，不能把筛选出来的结果当作全部数据存回去。</w:t>
       </w:r>
     </w:p>
     <w:p>
@@ -4104,89 +4347,32 @@
           <w:color w:val="000000"/>
           <w:sz w:val="21"/>
         </w:rPr>
-        <w:t>为了分清这两个容易照搬出错的地方，我单独运行了两个反例：在没有定义 t 的父回调环境里读取 t.text，得到 ReferenceError；对取消得到的 null 调用 trim()，得到 TypeError。这是主动做的对照检查。最后的代码先按 id 找任务、先拦住 null，没有把这两个反例放进应用。对输入后内容没有变化的情况，我也提前结束，避免没有实质修改却重复保存和重画。</w:t>
-      </w:r>
-    </w:p>
-    <w:p>
-      <w:pPr>
-        <w:keepNext/>
-        <w:keepLines/>
-        <w:pageBreakBefore w:val="0"/>
-        <w:spacing w:before="0" w:after="120" w:line="276" w:lineRule="auto"/>
-        <w:rPr>
-          <w:rFonts w:hint="eastAsia"/>
-        </w:rPr>
-      </w:pPr>
-      <w:r>
-        <w:rPr>
-          <w:rFonts w:ascii="Calibri" w:hAnsi="Calibri" w:eastAsia="宋体"/>
-          <w:b/>
-          <w:color w:val="000000"/>
-          <w:sz w:val="21"/>
-        </w:rPr>
-        <w:t>3. 改文字时保留原状态，再检查数据和界面</w:t>
-      </w:r>
-    </w:p>
-    <w:p>
-      <w:pPr>
-        <w:keepNext w:val="0"/>
-        <w:keepLines/>
-        <w:pageBreakBefore w:val="0"/>
-        <w:spacing w:before="0" w:after="120" w:line="276" w:lineRule="auto"/>
-        <w:rPr>
-          <w:rFonts w:hint="eastAsia"/>
-        </w:rPr>
-      </w:pPr>
-      <w:r>
-        <w:rPr>
-          <w:rFonts w:ascii="Calibri" w:hAnsi="Calibri" w:eastAsia="宋体"/>
-          <w:b w:val="0"/>
-          <w:color w:val="000000"/>
-          <w:sz w:val="21"/>
-        </w:rPr>
-        <w:t>我把真正的数据修改放在 updateTodo()，没有直接去改页面上的 span。map() 生成新数组，命中的任务用 { ...todo, text: value } 生成新对象，因此 id 和 completed 都保留下来，只替换 text；没有命中的任务仍返回原对象。随后 save() 保存完整 todos，render() 再根据当前筛选显示。这里要分清“页面现在显示了几条”和“完整数据有几条”，不能把筛选出来的结果当作全部数据存回去。</w:t>
-      </w:r>
-    </w:p>
-    <w:p>
-      <w:pPr>
-        <w:keepNext w:val="0"/>
-        <w:keepLines/>
-        <w:pageBreakBefore w:val="0"/>
-        <w:spacing w:before="0" w:after="120" w:line="276" w:lineRule="auto"/>
-        <w:rPr>
-          <w:rFonts w:hint="eastAsia"/>
-        </w:rPr>
-      </w:pPr>
-      <w:r>
-        <w:rPr>
-          <w:rFonts w:ascii="Calibri" w:hAnsi="Calibri" w:eastAsia="宋体"/>
-          <w:b w:val="0"/>
-          <w:color w:val="000000"/>
-          <w:sz w:val="21"/>
-        </w:rPr>
         <w:t>正常编辑时，我专门选了已完成的任务103，输入首尾带空格的“整理事件委托验证记录”。确认后文字去掉了首尾空格，任务仍然勾选；日志只有 [edit]，没有 [toggle]，存储中的 text 也与页面一致。这个例子同时检查了输入处理、状态保留和分支互斥。</w:t>
       </w:r>
     </w:p>
     <w:p>
       <w:pPr>
         <w:keepNext/>
-        <w:spacing w:line="240" w:lineRule="auto" w:before="60" w:after="60"/>
+        <w:spacing w:before="60" w:after="60" w:line="240" w:lineRule="auto"/>
         <w:jc w:val="center"/>
       </w:pPr>
       <w:r>
         <w:drawing>
-          <wp:inline xmlns:a="http://schemas.openxmlformats.org/drawingml/2006/main" xmlns:pic="http://schemas.openxmlformats.org/drawingml/2006/picture">
-            <wp:extent cx="5166360" cy="3321231"/>
+          <wp:inline distT="0" distB="0" distL="114300" distR="114300">
+            <wp:extent cx="5166360" cy="3321050"/>
+            <wp:effectExtent l="0" t="0" r="2540" b="6350"/>
             <wp:docPr id="4" name="Picture 4" descr="图4 任务3 修改已完成任务 文字更新而完成状态保留"/>
             <wp:cNvGraphicFramePr>
-              <a:graphicFrameLocks noChangeAspect="1"/>
+              <a:graphicFrameLocks xmlns:a="http://schemas.openxmlformats.org/drawingml/2006/main" noChangeAspect="1"/>
             </wp:cNvGraphicFramePr>
-            <a:graphic>
+            <a:graphic xmlns:a="http://schemas.openxmlformats.org/drawingml/2006/main">
               <a:graphicData uri="http://schemas.openxmlformats.org/drawingml/2006/picture">
-                <pic:pic>
+                <pic:pic xmlns:pic="http://schemas.openxmlformats.org/drawingml/2006/picture">
                   <pic:nvPicPr>
-                    <pic:cNvPr id="0" name="image.png"/>
-                    <pic:cNvPicPr/>
+                    <pic:cNvPr id="4" name="Picture 4" descr="图4 任务3 修改已完成任务 文字更新而完成状态保留"/>
+                    <pic:cNvPicPr>
+                      <a:picLocks noChangeAspect="1"/>
+                    </pic:cNvPicPr>
                   </pic:nvPicPr>
                   <pic:blipFill>
                     <a:blip r:embed="rId9"/>
@@ -4199,7 +4385,9 @@
                       <a:off x="0" y="0"/>
                       <a:ext cx="5166360" cy="3321231"/>
                     </a:xfrm>
-                    <a:prstGeom prst="rect"/>
+                    <a:prstGeom prst="rect">
+                      <a:avLst/>
+                    </a:prstGeom>
                   </pic:spPr>
                 </pic:pic>
               </a:graphicData>
@@ -4213,7 +4401,7 @@
         <w:keepNext w:val="0"/>
         <w:keepLines/>
         <w:pageBreakBefore w:val="0"/>
-        <w:spacing w:after="120" w:line="276" w:lineRule="auto" w:before="0"/>
+        <w:spacing w:before="0" w:after="120" w:line="276" w:lineRule="auto"/>
         <w:jc w:val="center"/>
       </w:pPr>
       <w:r>
@@ -4249,26 +4437,29 @@
     <w:p>
       <w:pPr>
         <w:keepNext/>
-        <w:spacing w:line="240" w:lineRule="auto" w:before="60" w:after="60"/>
+        <w:spacing w:before="60" w:after="60" w:line="240" w:lineRule="auto"/>
         <w:jc w:val="center"/>
       </w:pPr>
       <w:r>
         <w:drawing>
-          <wp:inline xmlns:a="http://schemas.openxmlformats.org/drawingml/2006/main" xmlns:pic="http://schemas.openxmlformats.org/drawingml/2006/picture">
-            <wp:extent cx="5166360" cy="3321231"/>
+          <wp:inline distT="0" distB="0" distL="114300" distR="114300">
+            <wp:extent cx="5166360" cy="3321050"/>
+            <wp:effectExtent l="0" t="0" r="2540" b="6350"/>
             <wp:docPr id="5" name="Picture 5" descr="图5 任务3 纯空格输入被拦截 原任务和存储保持不变"/>
             <wp:cNvGraphicFramePr>
-              <a:graphicFrameLocks noChangeAspect="1"/>
+              <a:graphicFrameLocks xmlns:a="http://schemas.openxmlformats.org/drawingml/2006/main" noChangeAspect="1"/>
             </wp:cNvGraphicFramePr>
-            <a:graphic>
+            <a:graphic xmlns:a="http://schemas.openxmlformats.org/drawingml/2006/main">
               <a:graphicData uri="http://schemas.openxmlformats.org/drawingml/2006/picture">
-                <pic:pic>
+                <pic:pic xmlns:pic="http://schemas.openxmlformats.org/drawingml/2006/picture">
                   <pic:nvPicPr>
-                    <pic:cNvPr id="0" name="任务3_空输入.png"/>
-                    <pic:cNvPicPr/>
+                    <pic:cNvPr id="5" name="Picture 5" descr="图5 任务3 纯空格输入被拦截 原任务和存储保持不变"/>
+                    <pic:cNvPicPr>
+                      <a:picLocks noChangeAspect="1"/>
+                    </pic:cNvPicPr>
                   </pic:nvPicPr>
                   <pic:blipFill>
-                    <a:blip r:embed="rId13"/>
+                    <a:blip r:embed="rId10"/>
                     <a:stretch>
                       <a:fillRect/>
                     </a:stretch>
@@ -4278,7 +4469,9 @@
                       <a:off x="0" y="0"/>
                       <a:ext cx="5166360" cy="3321231"/>
                     </a:xfrm>
-                    <a:prstGeom prst="rect"/>
+                    <a:prstGeom prst="rect">
+                      <a:avLst/>
+                    </a:prstGeom>
                   </pic:spPr>
                 </pic:pic>
               </a:graphicData>
@@ -4292,7 +4485,7 @@
         <w:keepNext w:val="0"/>
         <w:keepLines/>
         <w:pageBreakBefore w:val="0"/>
-        <w:spacing w:after="120" w:line="276" w:lineRule="auto" w:before="0"/>
+        <w:spacing w:before="0" w:after="120" w:line="276" w:lineRule="auto"/>
         <w:jc w:val="center"/>
       </w:pPr>
       <w:r>
@@ -4372,18 +4565,42 @@
         <w:pageBreakBefore w:val="0"/>
         <w:spacing w:before="0" w:after="120" w:line="276" w:lineRule="auto"/>
         <w:rPr>
-          <w:rFonts w:hint="eastAsia"/>
-        </w:rPr>
-      </w:pPr>
-      <w:r>
-        <w:rPr>
           <w:rFonts w:ascii="Calibri" w:hAnsi="Calibri" w:eastAsia="宋体"/>
           <w:b w:val="0"/>
           <w:color w:val="000000"/>
           <w:sz w:val="21"/>
         </w:rPr>
-        <w:t>AI 参与了代码实现、边界分析和浏览器测试。我对照代码梳理了事件定位、输入检查和数据更新的原因；完全脱离现有实现从头完成，还需要再做一次练习来确认。</w:t>
+      </w:pPr>
+      <w:r>
+        <w:rPr>
+          <w:rFonts w:ascii="Calibri" w:hAnsi="Calibri" w:eastAsia="宋体"/>
+          <w:b w:val="0"/>
+          <w:color w:val="000000"/>
+          <w:sz w:val="21"/>
+        </w:rPr>
+        <w:t>用在编辑分支的思路梳理、代码参考和辅助检查上，重点核对原文字的获取、取消与空输入的处理，以及修改后是否保留原来的完成状态。</w:t>
       </w:r>
+    </w:p>
+    <w:p>
+      <w:pPr>
+        <w:keepNext w:val="0"/>
+        <w:keepLines/>
+        <w:pageBreakBefore w:val="0"/>
+        <w:spacing w:before="0" w:after="120" w:line="276" w:lineRule="auto"/>
+        <w:rPr>
+          <w:rFonts w:hint="default" w:eastAsia="宋体"/>
+          <w:lang w:val="en-US" w:eastAsia="zh-CN"/>
+        </w:rPr>
+      </w:pPr>
+      <w:r>
+        <w:rPr>
+          <w:rFonts w:hint="eastAsia"/>
+          <w:lang w:val="en-US" w:eastAsia="zh-CN"/>
+        </w:rPr>
+        <w:t>能脱离完成。</w:t>
+      </w:r>
+      <w:bookmarkStart w:id="0" w:name="_GoBack"/>
+      <w:bookmarkEnd w:id="0"/>
     </w:p>
     <w:p>
       <w:pPr>
@@ -4756,7 +4973,7 @@
     <w:lsdException w:qFormat="1" w:unhideWhenUsed="0" w:uiPriority="10" w:semiHidden="0" w:name="Title"/>
     <w:lsdException w:uiPriority="99" w:name="Closing"/>
     <w:lsdException w:uiPriority="99" w:name="Signature"/>
-    <w:lsdException w:uiPriority="1" w:name="Default Paragraph Font"/>
+    <w:lsdException w:qFormat="1" w:uiPriority="1" w:name="Default Paragraph Font"/>
     <w:lsdException w:qFormat="1" w:uiPriority="99" w:semiHidden="0" w:name="Body Text"/>
     <w:lsdException w:uiPriority="99" w:name="Body Text Indent"/>
     <w:lsdException w:qFormat="1" w:uiPriority="99" w:semiHidden="0" w:name="List Continue"/>
@@ -4787,7 +5004,7 @@
     <w:lsdException w:uiPriority="99" w:name="HTML Acronym"/>
     <w:lsdException w:uiPriority="99" w:name="HTML Address"/>
     <w:lsdException w:uiPriority="99" w:name="HTML Cite"/>
-    <w:lsdException w:uiPriority="99" w:name="HTML Code"/>
+    <w:lsdException w:qFormat="1" w:uiPriority="99" w:name="HTML Code"/>
     <w:lsdException w:uiPriority="99" w:name="HTML Definition"/>
     <w:lsdException w:uiPriority="99" w:name="HTML Keyboard"/>
     <w:lsdException w:uiPriority="99" w:name="HTML Preformatted"/>
@@ -4845,23 +5062,23 @@
     <w:lsdException w:qFormat="1" w:unhideWhenUsed="0" w:uiPriority="60" w:semiHidden="0" w:name="Light Shading"/>
     <w:lsdException w:qFormat="1" w:unhideWhenUsed="0" w:uiPriority="61" w:semiHidden="0" w:name="Light List"/>
     <w:lsdException w:qFormat="1" w:unhideWhenUsed="0" w:uiPriority="62" w:semiHidden="0" w:name="Light Grid"/>
-    <w:lsdException w:unhideWhenUsed="0" w:uiPriority="63" w:semiHidden="0" w:name="Medium Shading 1"/>
+    <w:lsdException w:qFormat="1" w:unhideWhenUsed="0" w:uiPriority="63" w:semiHidden="0" w:name="Medium Shading 1"/>
     <w:lsdException w:qFormat="1" w:unhideWhenUsed="0" w:uiPriority="64" w:semiHidden="0" w:name="Medium Shading 2"/>
-    <w:lsdException w:unhideWhenUsed="0" w:uiPriority="65" w:semiHidden="0" w:name="Medium List 1"/>
-    <w:lsdException w:unhideWhenUsed="0" w:uiPriority="66" w:semiHidden="0" w:name="Medium List 2"/>
-    <w:lsdException w:unhideWhenUsed="0" w:uiPriority="67" w:semiHidden="0" w:name="Medium Grid 1"/>
+    <w:lsdException w:qFormat="1" w:unhideWhenUsed="0" w:uiPriority="65" w:semiHidden="0" w:name="Medium List 1"/>
+    <w:lsdException w:qFormat="1" w:unhideWhenUsed="0" w:uiPriority="66" w:semiHidden="0" w:name="Medium List 2"/>
+    <w:lsdException w:qFormat="1" w:unhideWhenUsed="0" w:uiPriority="67" w:semiHidden="0" w:name="Medium Grid 1"/>
     <w:lsdException w:qFormat="1" w:unhideWhenUsed="0" w:uiPriority="68" w:semiHidden="0" w:name="Medium Grid 2"/>
     <w:lsdException w:qFormat="1" w:unhideWhenUsed="0" w:uiPriority="69" w:semiHidden="0" w:name="Medium Grid 3"/>
     <w:lsdException w:qFormat="1" w:unhideWhenUsed="0" w:uiPriority="70" w:semiHidden="0" w:name="Dark List"/>
-    <w:lsdException w:unhideWhenUsed="0" w:uiPriority="71" w:semiHidden="0" w:name="Colorful Shading"/>
+    <w:lsdException w:qFormat="1" w:unhideWhenUsed="0" w:uiPriority="71" w:semiHidden="0" w:name="Colorful Shading"/>
     <w:lsdException w:qFormat="1" w:unhideWhenUsed="0" w:uiPriority="72" w:semiHidden="0" w:name="Colorful List"/>
     <w:lsdException w:qFormat="1" w:unhideWhenUsed="0" w:uiPriority="73" w:semiHidden="0" w:name="Colorful Grid"/>
     <w:lsdException w:qFormat="1" w:unhideWhenUsed="0" w:uiPriority="60" w:semiHidden="0" w:name="Light Shading Accent 1"/>
     <w:lsdException w:qFormat="1" w:unhideWhenUsed="0" w:uiPriority="61" w:semiHidden="0" w:name="Light List Accent 1"/>
-    <w:lsdException w:unhideWhenUsed="0" w:uiPriority="62" w:semiHidden="0" w:name="Light Grid Accent 1"/>
+    <w:lsdException w:qFormat="1" w:unhideWhenUsed="0" w:uiPriority="62" w:semiHidden="0" w:name="Light Grid Accent 1"/>
     <w:lsdException w:qFormat="1" w:unhideWhenUsed="0" w:uiPriority="63" w:semiHidden="0" w:name="Medium Shading 1 Accent 1"/>
-    <w:lsdException w:unhideWhenUsed="0" w:uiPriority="64" w:semiHidden="0" w:name="Medium Shading 2 Accent 1"/>
-    <w:lsdException w:unhideWhenUsed="0" w:uiPriority="65" w:semiHidden="0" w:name="Medium List 1 Accent 1"/>
+    <w:lsdException w:qFormat="1" w:unhideWhenUsed="0" w:uiPriority="64" w:semiHidden="0" w:name="Medium Shading 2 Accent 1"/>
+    <w:lsdException w:qFormat="1" w:unhideWhenUsed="0" w:uiPriority="65" w:semiHidden="0" w:name="Medium List 1 Accent 1"/>
     <w:lsdException w:qFormat="1" w:unhideWhenUsed="0" w:uiPriority="34" w:semiHidden="0" w:name="List Paragraph"/>
     <w:lsdException w:qFormat="1" w:unhideWhenUsed="0" w:uiPriority="29" w:semiHidden="0" w:name="Quote"/>
     <w:lsdException w:qFormat="1" w:unhideWhenUsed="0" w:uiPriority="30" w:semiHidden="0" w:name="Intense Quote"/>
@@ -4876,51 +5093,51 @@
     <w:lsdException w:qFormat="1" w:unhideWhenUsed="0" w:uiPriority="60" w:semiHidden="0" w:name="Light Shading Accent 2"/>
     <w:lsdException w:qFormat="1" w:unhideWhenUsed="0" w:uiPriority="61" w:semiHidden="0" w:name="Light List Accent 2"/>
     <w:lsdException w:qFormat="1" w:unhideWhenUsed="0" w:uiPriority="62" w:semiHidden="0" w:name="Light Grid Accent 2"/>
-    <w:lsdException w:unhideWhenUsed="0" w:uiPriority="63" w:semiHidden="0" w:name="Medium Shading 1 Accent 2"/>
-    <w:lsdException w:unhideWhenUsed="0" w:uiPriority="64" w:semiHidden="0" w:name="Medium Shading 2 Accent 2"/>
-    <w:lsdException w:unhideWhenUsed="0" w:uiPriority="65" w:semiHidden="0" w:name="Medium List 1 Accent 2"/>
-    <w:lsdException w:unhideWhenUsed="0" w:uiPriority="66" w:semiHidden="0" w:name="Medium List 2 Accent 2"/>
+    <w:lsdException w:qFormat="1" w:unhideWhenUsed="0" w:uiPriority="63" w:semiHidden="0" w:name="Medium Shading 1 Accent 2"/>
+    <w:lsdException w:qFormat="1" w:unhideWhenUsed="0" w:uiPriority="64" w:semiHidden="0" w:name="Medium Shading 2 Accent 2"/>
+    <w:lsdException w:qFormat="1" w:unhideWhenUsed="0" w:uiPriority="65" w:semiHidden="0" w:name="Medium List 1 Accent 2"/>
+    <w:lsdException w:qFormat="1" w:unhideWhenUsed="0" w:uiPriority="66" w:semiHidden="0" w:name="Medium List 2 Accent 2"/>
     <w:lsdException w:qFormat="1" w:unhideWhenUsed="0" w:uiPriority="67" w:semiHidden="0" w:name="Medium Grid 1 Accent 2"/>
     <w:lsdException w:qFormat="1" w:unhideWhenUsed="0" w:uiPriority="68" w:semiHidden="0" w:name="Medium Grid 2 Accent 2"/>
     <w:lsdException w:qFormat="1" w:unhideWhenUsed="0" w:uiPriority="69" w:semiHidden="0" w:name="Medium Grid 3 Accent 2"/>
     <w:lsdException w:qFormat="1" w:unhideWhenUsed="0" w:uiPriority="70" w:semiHidden="0" w:name="Dark List Accent 2"/>
     <w:lsdException w:qFormat="1" w:unhideWhenUsed="0" w:uiPriority="71" w:semiHidden="0" w:name="Colorful Shading Accent 2"/>
-    <w:lsdException w:unhideWhenUsed="0" w:uiPriority="72" w:semiHidden="0" w:name="Colorful List Accent 2"/>
+    <w:lsdException w:qFormat="1" w:unhideWhenUsed="0" w:uiPriority="72" w:semiHidden="0" w:name="Colorful List Accent 2"/>
     <w:lsdException w:qFormat="1" w:unhideWhenUsed="0" w:uiPriority="73" w:semiHidden="0" w:name="Colorful Grid Accent 2"/>
     <w:lsdException w:qFormat="1" w:unhideWhenUsed="0" w:uiPriority="60" w:semiHidden="0" w:name="Light Shading Accent 3"/>
     <w:lsdException w:qFormat="1" w:unhideWhenUsed="0" w:uiPriority="61" w:semiHidden="0" w:name="Light List Accent 3"/>
-    <w:lsdException w:unhideWhenUsed="0" w:uiPriority="62" w:semiHidden="0" w:name="Light Grid Accent 3"/>
-    <w:lsdException w:unhideWhenUsed="0" w:uiPriority="63" w:semiHidden="0" w:name="Medium Shading 1 Accent 3"/>
-    <w:lsdException w:unhideWhenUsed="0" w:uiPriority="64" w:semiHidden="0" w:name="Medium Shading 2 Accent 3"/>
+    <w:lsdException w:qFormat="1" w:unhideWhenUsed="0" w:uiPriority="62" w:semiHidden="0" w:name="Light Grid Accent 3"/>
+    <w:lsdException w:qFormat="1" w:unhideWhenUsed="0" w:uiPriority="63" w:semiHidden="0" w:name="Medium Shading 1 Accent 3"/>
+    <w:lsdException w:qFormat="1" w:unhideWhenUsed="0" w:uiPriority="64" w:semiHidden="0" w:name="Medium Shading 2 Accent 3"/>
     <w:lsdException w:qFormat="1" w:unhideWhenUsed="0" w:uiPriority="65" w:semiHidden="0" w:name="Medium List 1 Accent 3"/>
     <w:lsdException w:qFormat="1" w:unhideWhenUsed="0" w:uiPriority="66" w:semiHidden="0" w:name="Medium List 2 Accent 3"/>
     <w:lsdException w:qFormat="1" w:unhideWhenUsed="0" w:uiPriority="67" w:semiHidden="0" w:name="Medium Grid 1 Accent 3"/>
     <w:lsdException w:qFormat="1" w:unhideWhenUsed="0" w:uiPriority="68" w:semiHidden="0" w:name="Medium Grid 2 Accent 3"/>
     <w:lsdException w:qFormat="1" w:unhideWhenUsed="0" w:uiPriority="69" w:semiHidden="0" w:name="Medium Grid 3 Accent 3"/>
     <w:lsdException w:qFormat="1" w:unhideWhenUsed="0" w:uiPriority="70" w:semiHidden="0" w:name="Dark List Accent 3"/>
-    <w:lsdException w:unhideWhenUsed="0" w:uiPriority="71" w:semiHidden="0" w:name="Colorful Shading Accent 3"/>
+    <w:lsdException w:qFormat="1" w:unhideWhenUsed="0" w:uiPriority="71" w:semiHidden="0" w:name="Colorful Shading Accent 3"/>
     <w:lsdException w:qFormat="1" w:unhideWhenUsed="0" w:uiPriority="72" w:semiHidden="0" w:name="Colorful List Accent 3"/>
-    <w:lsdException w:unhideWhenUsed="0" w:uiPriority="73" w:semiHidden="0" w:name="Colorful Grid Accent 3"/>
+    <w:lsdException w:qFormat="1" w:unhideWhenUsed="0" w:uiPriority="73" w:semiHidden="0" w:name="Colorful Grid Accent 3"/>
     <w:lsdException w:qFormat="1" w:unhideWhenUsed="0" w:uiPriority="60" w:semiHidden="0" w:name="Light Shading Accent 4"/>
     <w:lsdException w:qFormat="1" w:unhideWhenUsed="0" w:uiPriority="61" w:semiHidden="0" w:name="Light List Accent 4"/>
     <w:lsdException w:qFormat="1" w:unhideWhenUsed="0" w:uiPriority="62" w:semiHidden="0" w:name="Light Grid Accent 4"/>
-    <w:lsdException w:unhideWhenUsed="0" w:uiPriority="63" w:semiHidden="0" w:name="Medium Shading 1 Accent 4"/>
-    <w:lsdException w:unhideWhenUsed="0" w:uiPriority="64" w:semiHidden="0" w:name="Medium Shading 2 Accent 4"/>
-    <w:lsdException w:unhideWhenUsed="0" w:uiPriority="65" w:semiHidden="0" w:name="Medium List 1 Accent 4"/>
-    <w:lsdException w:unhideWhenUsed="0" w:uiPriority="66" w:semiHidden="0" w:name="Medium List 2 Accent 4"/>
+    <w:lsdException w:qFormat="1" w:unhideWhenUsed="0" w:uiPriority="63" w:semiHidden="0" w:name="Medium Shading 1 Accent 4"/>
+    <w:lsdException w:qFormat="1" w:unhideWhenUsed="0" w:uiPriority="64" w:semiHidden="0" w:name="Medium Shading 2 Accent 4"/>
+    <w:lsdException w:qFormat="1" w:unhideWhenUsed="0" w:uiPriority="65" w:semiHidden="0" w:name="Medium List 1 Accent 4"/>
+    <w:lsdException w:qFormat="1" w:unhideWhenUsed="0" w:uiPriority="66" w:semiHidden="0" w:name="Medium List 2 Accent 4"/>
     <w:lsdException w:qFormat="1" w:unhideWhenUsed="0" w:uiPriority="67" w:semiHidden="0" w:name="Medium Grid 1 Accent 4"/>
     <w:lsdException w:qFormat="1" w:unhideWhenUsed="0" w:uiPriority="68" w:semiHidden="0" w:name="Medium Grid 2 Accent 4"/>
     <w:lsdException w:qFormat="1" w:unhideWhenUsed="0" w:uiPriority="69" w:semiHidden="0" w:name="Medium Grid 3 Accent 4"/>
     <w:lsdException w:qFormat="1" w:unhideWhenUsed="0" w:uiPriority="70" w:semiHidden="0" w:name="Dark List Accent 4"/>
     <w:lsdException w:qFormat="1" w:unhideWhenUsed="0" w:uiPriority="71" w:semiHidden="0" w:name="Colorful Shading Accent 4"/>
-    <w:lsdException w:unhideWhenUsed="0" w:uiPriority="72" w:semiHidden="0" w:name="Colorful List Accent 4"/>
-    <w:lsdException w:unhideWhenUsed="0" w:uiPriority="73" w:semiHidden="0" w:name="Colorful Grid Accent 4"/>
+    <w:lsdException w:qFormat="1" w:unhideWhenUsed="0" w:uiPriority="72" w:semiHidden="0" w:name="Colorful List Accent 4"/>
+    <w:lsdException w:qFormat="1" w:unhideWhenUsed="0" w:uiPriority="73" w:semiHidden="0" w:name="Colorful Grid Accent 4"/>
     <w:lsdException w:qFormat="1" w:unhideWhenUsed="0" w:uiPriority="60" w:semiHidden="0" w:name="Light Shading Accent 5"/>
     <w:lsdException w:qFormat="1" w:unhideWhenUsed="0" w:uiPriority="61" w:semiHidden="0" w:name="Light List Accent 5"/>
-    <w:lsdException w:unhideWhenUsed="0" w:uiPriority="62" w:semiHidden="0" w:name="Light Grid Accent 5"/>
+    <w:lsdException w:qFormat="1" w:unhideWhenUsed="0" w:uiPriority="62" w:semiHidden="0" w:name="Light Grid Accent 5"/>
     <w:lsdException w:qFormat="1" w:unhideWhenUsed="0" w:uiPriority="63" w:semiHidden="0" w:name="Medium Shading 1 Accent 5"/>
-    <w:lsdException w:unhideWhenUsed="0" w:uiPriority="64" w:semiHidden="0" w:name="Medium Shading 2 Accent 5"/>
-    <w:lsdException w:unhideWhenUsed="0" w:uiPriority="65" w:semiHidden="0" w:name="Medium List 1 Accent 5"/>
+    <w:lsdException w:qFormat="1" w:unhideWhenUsed="0" w:uiPriority="64" w:semiHidden="0" w:name="Medium Shading 2 Accent 5"/>
+    <w:lsdException w:qFormat="1" w:unhideWhenUsed="0" w:uiPriority="65" w:semiHidden="0" w:name="Medium List 1 Accent 5"/>
     <w:lsdException w:qFormat="1" w:unhideWhenUsed="0" w:uiPriority="66" w:semiHidden="0" w:name="Medium List 2 Accent 5"/>
     <w:lsdException w:qFormat="1" w:unhideWhenUsed="0" w:uiPriority="67" w:semiHidden="0" w:name="Medium Grid 1 Accent 5"/>
     <w:lsdException w:qFormat="1" w:unhideWhenUsed="0" w:uiPriority="68" w:semiHidden="0" w:name="Medium Grid 2 Accent 5"/>
@@ -4933,14 +5150,14 @@
     <w:lsdException w:qFormat="1" w:unhideWhenUsed="0" w:uiPriority="61" w:semiHidden="0" w:name="Light List Accent 6"/>
     <w:lsdException w:qFormat="1" w:unhideWhenUsed="0" w:uiPriority="62" w:semiHidden="0" w:name="Light Grid Accent 6"/>
     <w:lsdException w:qFormat="1" w:unhideWhenUsed="0" w:uiPriority="63" w:semiHidden="0" w:name="Medium Shading 1 Accent 6"/>
-    <w:lsdException w:unhideWhenUsed="0" w:uiPriority="64" w:semiHidden="0" w:name="Medium Shading 2 Accent 6"/>
-    <w:lsdException w:unhideWhenUsed="0" w:uiPriority="65" w:semiHidden="0" w:name="Medium List 1 Accent 6"/>
-    <w:lsdException w:unhideWhenUsed="0" w:uiPriority="66" w:semiHidden="0" w:name="Medium List 2 Accent 6"/>
+    <w:lsdException w:qFormat="1" w:unhideWhenUsed="0" w:uiPriority="64" w:semiHidden="0" w:name="Medium Shading 2 Accent 6"/>
+    <w:lsdException w:qFormat="1" w:unhideWhenUsed="0" w:uiPriority="65" w:semiHidden="0" w:name="Medium List 1 Accent 6"/>
+    <w:lsdException w:qFormat="1" w:unhideWhenUsed="0" w:uiPriority="66" w:semiHidden="0" w:name="Medium List 2 Accent 6"/>
     <w:lsdException w:qFormat="1" w:unhideWhenUsed="0" w:uiPriority="67" w:semiHidden="0" w:name="Medium Grid 1 Accent 6"/>
     <w:lsdException w:qFormat="1" w:unhideWhenUsed="0" w:uiPriority="68" w:semiHidden="0" w:name="Medium Grid 2 Accent 6"/>
     <w:lsdException w:qFormat="1" w:unhideWhenUsed="0" w:uiPriority="69" w:semiHidden="0" w:name="Medium Grid 3 Accent 6"/>
     <w:lsdException w:qFormat="1" w:unhideWhenUsed="0" w:uiPriority="70" w:semiHidden="0" w:name="Dark List Accent 6"/>
-    <w:lsdException w:unhideWhenUsed="0" w:uiPriority="71" w:semiHidden="0" w:name="Colorful Shading Accent 6"/>
+    <w:lsdException w:qFormat="1" w:unhideWhenUsed="0" w:uiPriority="71" w:semiHidden="0" w:name="Colorful Shading Accent 6"/>
     <w:lsdException w:qFormat="1" w:unhideWhenUsed="0" w:uiPriority="72" w:semiHidden="0" w:name="Colorful List Accent 6"/>
     <w:lsdException w:qFormat="1" w:unhideWhenUsed="0" w:uiPriority="73" w:semiHidden="0" w:name="Colorful Grid Accent 6"/>
   </w:latentStyles>
@@ -4962,7 +5179,7 @@
     <w:name w:val="heading 1"/>
     <w:basedOn w:val="1"/>
     <w:next w:val="1"/>
-    <w:link w:val="139"/>
+    <w:link w:val="140"/>
     <w:qFormat/>
     <w:uiPriority w:val="9"/>
     <w:pPr>
@@ -4984,7 +5201,7 @@
     <w:name w:val="heading 2"/>
     <w:basedOn w:val="1"/>
     <w:next w:val="1"/>
-    <w:link w:val="140"/>
+    <w:link w:val="141"/>
     <w:unhideWhenUsed/>
     <w:qFormat/>
     <w:uiPriority w:val="9"/>
@@ -5012,7 +5229,7 @@
     <w:name w:val="heading 3"/>
     <w:basedOn w:val="1"/>
     <w:next w:val="1"/>
-    <w:link w:val="141"/>
+    <w:link w:val="142"/>
     <w:unhideWhenUsed/>
     <w:qFormat/>
     <w:uiPriority w:val="9"/>
@@ -5038,7 +5255,7 @@
     <w:name w:val="heading 4"/>
     <w:basedOn w:val="1"/>
     <w:next w:val="1"/>
-    <w:link w:val="151"/>
+    <w:link w:val="152"/>
     <w:semiHidden/>
     <w:unhideWhenUsed/>
     <w:qFormat/>
@@ -5067,7 +5284,7 @@
     <w:name w:val="heading 5"/>
     <w:basedOn w:val="1"/>
     <w:next w:val="1"/>
-    <w:link w:val="152"/>
+    <w:link w:val="153"/>
     <w:semiHidden/>
     <w:unhideWhenUsed/>
     <w:qFormat/>
@@ -5087,7 +5304,7 @@
     <w:name w:val="heading 6"/>
     <w:basedOn w:val="1"/>
     <w:next w:val="1"/>
-    <w:link w:val="153"/>
+    <w:link w:val="154"/>
     <w:semiHidden/>
     <w:unhideWhenUsed/>
     <w:qFormat/>
@@ -5109,7 +5326,7 @@
     <w:name w:val="heading 7"/>
     <w:basedOn w:val="1"/>
     <w:next w:val="1"/>
-    <w:link w:val="154"/>
+    <w:link w:val="155"/>
     <w:semiHidden/>
     <w:unhideWhenUsed/>
     <w:qFormat/>
@@ -5139,7 +5356,7 @@
     <w:name w:val="heading 8"/>
     <w:basedOn w:val="1"/>
     <w:next w:val="1"/>
-    <w:link w:val="155"/>
+    <w:link w:val="156"/>
     <w:semiHidden/>
     <w:unhideWhenUsed/>
     <w:qFormat/>
@@ -5166,7 +5383,7 @@
     <w:name w:val="heading 9"/>
     <w:basedOn w:val="1"/>
     <w:next w:val="1"/>
-    <w:link w:val="156"/>
+    <w:link w:val="157"/>
     <w:semiHidden/>
     <w:unhideWhenUsed/>
     <w:qFormat/>
@@ -5194,13 +5411,14 @@
       </w14:textFill>
     </w:rPr>
   </w:style>
-  <w:style w:type="character" w:default="1" w:styleId="132">
+  <w:style w:type="character" w:default="1" w:styleId="133">
     <w:name w:val="Default Paragraph Font"/>
     <w:semiHidden/>
     <w:unhideWhenUsed/>
+    <w:qFormat/>
     <w:uiPriority w:val="1"/>
   </w:style>
-  <w:style w:type="table" w:default="1" w:styleId="32">
+  <w:style w:type="table" w:default="1" w:styleId="33">
     <w:name w:val="Normal Table"/>
     <w:semiHidden/>
     <w:unhideWhenUsed/>
@@ -5217,7 +5435,7 @@
   </w:style>
   <w:style w:type="paragraph" w:styleId="2">
     <w:name w:val="macro"/>
-    <w:link w:val="148"/>
+    <w:link w:val="149"/>
     <w:unhideWhenUsed/>
     <w:qFormat/>
     <w:uiPriority w:val="99"/>
@@ -5320,7 +5538,7 @@
   <w:style w:type="paragraph" w:styleId="17">
     <w:name w:val="Body Text 3"/>
     <w:basedOn w:val="1"/>
-    <w:link w:val="147"/>
+    <w:link w:val="148"/>
     <w:unhideWhenUsed/>
     <w:qFormat/>
     <w:uiPriority w:val="99"/>
@@ -5349,7 +5567,7 @@
   <w:style w:type="paragraph" w:styleId="19">
     <w:name w:val="Body Text"/>
     <w:basedOn w:val="1"/>
-    <w:link w:val="145"/>
+    <w:link w:val="146"/>
     <w:unhideWhenUsed/>
     <w:qFormat/>
     <w:uiPriority w:val="99"/>
@@ -5411,7 +5629,7 @@
   <w:style w:type="paragraph" w:styleId="24">
     <w:name w:val="footer"/>
     <w:basedOn w:val="1"/>
-    <w:link w:val="137"/>
+    <w:link w:val="138"/>
     <w:unhideWhenUsed/>
     <w:qFormat/>
     <w:uiPriority w:val="99"/>
@@ -5426,7 +5644,7 @@
   <w:style w:type="paragraph" w:styleId="25">
     <w:name w:val="header"/>
     <w:basedOn w:val="1"/>
-    <w:link w:val="136"/>
+    <w:link w:val="137"/>
     <w:unhideWhenUsed/>
     <w:qFormat/>
     <w:uiPriority w:val="99"/>
@@ -5442,7 +5660,7 @@
     <w:name w:val="Subtitle"/>
     <w:basedOn w:val="1"/>
     <w:next w:val="1"/>
-    <w:link w:val="143"/>
+    <w:link w:val="144"/>
     <w:qFormat/>
     <w:uiPriority w:val="11"/>
     <w:rPr>
@@ -5474,7 +5692,7 @@
   <w:style w:type="paragraph" w:styleId="28">
     <w:name w:val="Body Text 2"/>
     <w:basedOn w:val="1"/>
-    <w:link w:val="146"/>
+    <w:link w:val="147"/>
     <w:unhideWhenUsed/>
     <w:qFormat/>
     <w:uiPriority w:val="99"/>
@@ -5495,6 +5713,23 @@
     </w:pPr>
   </w:style>
   <w:style w:type="paragraph" w:styleId="30">
+    <w:name w:val="Normal (Web)"/>
+    <w:basedOn w:val="1"/>
+    <w:semiHidden/>
+    <w:unhideWhenUsed/>
+    <w:uiPriority w:val="99"/>
+    <w:pPr>
+      <w:spacing w:before="0" w:beforeAutospacing="1" w:after="0" w:afterAutospacing="1"/>
+      <w:ind w:left="0" w:right="0"/>
+      <w:jc w:val="left"/>
+    </w:pPr>
+    <w:rPr>
+      <w:kern w:val="0"/>
+      <w:sz w:val="24"/>
+      <w:lang w:val="en-US" w:eastAsia="zh-CN" w:bidi="ar"/>
+    </w:rPr>
+  </w:style>
+  <w:style w:type="paragraph" w:styleId="31">
     <w:name w:val="List Continue 3"/>
     <w:basedOn w:val="1"/>
     <w:unhideWhenUsed/>
@@ -5506,11 +5741,11 @@
       <w:contextualSpacing/>
     </w:pPr>
   </w:style>
-  <w:style w:type="paragraph" w:styleId="31">
+  <w:style w:type="paragraph" w:styleId="32">
     <w:name w:val="Title"/>
     <w:basedOn w:val="1"/>
     <w:next w:val="1"/>
-    <w:link w:val="142"/>
+    <w:link w:val="143"/>
     <w:qFormat/>
     <w:uiPriority w:val="10"/>
     <w:pPr>
@@ -5529,9 +5764,9 @@
       <w:szCs w:val="52"/>
     </w:rPr>
   </w:style>
-  <w:style w:type="table" w:styleId="33">
+  <w:style w:type="table" w:styleId="34">
     <w:name w:val="Table Grid"/>
-    <w:basedOn w:val="32"/>
+    <w:basedOn w:val="33"/>
     <w:qFormat/>
     <w:uiPriority w:val="59"/>
     <w:pPr>
@@ -5554,9 +5789,9 @@
       </w:tblCellMar>
     </w:tblPr>
   </w:style>
-  <w:style w:type="table" w:styleId="34">
+  <w:style w:type="table" w:styleId="35">
     <w:name w:val="Light Shading"/>
-    <w:basedOn w:val="32"/>
+    <w:basedOn w:val="33"/>
     <w:qFormat/>
     <w:uiPriority w:val="60"/>
     <w:pPr>
@@ -5654,9 +5889,9 @@
       </w:tcPr>
     </w:tblStylePr>
   </w:style>
-  <w:style w:type="table" w:styleId="35">
+  <w:style w:type="table" w:styleId="36">
     <w:name w:val="Light Shading Accent 1"/>
-    <w:basedOn w:val="32"/>
+    <w:basedOn w:val="33"/>
     <w:qFormat/>
     <w:uiPriority w:val="60"/>
     <w:pPr>
@@ -5754,9 +5989,9 @@
       </w:tcPr>
     </w:tblStylePr>
   </w:style>
-  <w:style w:type="table" w:styleId="36">
+  <w:style w:type="table" w:styleId="37">
     <w:name w:val="Light Shading Accent 2"/>
-    <w:basedOn w:val="32"/>
+    <w:basedOn w:val="33"/>
     <w:qFormat/>
     <w:uiPriority w:val="60"/>
     <w:pPr>
@@ -5854,9 +6089,9 @@
       </w:tcPr>
     </w:tblStylePr>
   </w:style>
-  <w:style w:type="table" w:styleId="37">
+  <w:style w:type="table" w:styleId="38">
     <w:name w:val="Light Shading Accent 3"/>
-    <w:basedOn w:val="32"/>
+    <w:basedOn w:val="33"/>
     <w:qFormat/>
     <w:uiPriority w:val="60"/>
     <w:pPr>
@@ -5954,9 +6189,9 @@
       </w:tcPr>
     </w:tblStylePr>
   </w:style>
-  <w:style w:type="table" w:styleId="38">
+  <w:style w:type="table" w:styleId="39">
     <w:name w:val="Light Shading Accent 4"/>
-    <w:basedOn w:val="32"/>
+    <w:basedOn w:val="33"/>
     <w:qFormat/>
     <w:uiPriority w:val="60"/>
     <w:pPr>
@@ -6054,9 +6289,9 @@
       </w:tcPr>
     </w:tblStylePr>
   </w:style>
-  <w:style w:type="table" w:styleId="39">
+  <w:style w:type="table" w:styleId="40">
     <w:name w:val="Light Shading Accent 5"/>
-    <w:basedOn w:val="32"/>
+    <w:basedOn w:val="33"/>
     <w:qFormat/>
     <w:uiPriority w:val="60"/>
     <w:pPr>
@@ -6154,9 +6389,9 @@
       </w:tcPr>
     </w:tblStylePr>
   </w:style>
-  <w:style w:type="table" w:styleId="40">
+  <w:style w:type="table" w:styleId="41">
     <w:name w:val="Light Shading Accent 6"/>
-    <w:basedOn w:val="32"/>
+    <w:basedOn w:val="33"/>
     <w:qFormat/>
     <w:uiPriority w:val="60"/>
     <w:pPr>
@@ -6254,9 +6489,9 @@
       </w:tcPr>
     </w:tblStylePr>
   </w:style>
-  <w:style w:type="table" w:styleId="41">
+  <w:style w:type="table" w:styleId="42">
     <w:name w:val="Light List"/>
-    <w:basedOn w:val="32"/>
+    <w:basedOn w:val="33"/>
     <w:qFormat/>
     <w:uiPriority w:val="61"/>
     <w:pPr>
@@ -6348,9 +6583,9 @@
       </w:tcPr>
     </w:tblStylePr>
   </w:style>
-  <w:style w:type="table" w:styleId="42">
+  <w:style w:type="table" w:styleId="43">
     <w:name w:val="Light List Accent 1"/>
-    <w:basedOn w:val="32"/>
+    <w:basedOn w:val="33"/>
     <w:qFormat/>
     <w:uiPriority w:val="61"/>
     <w:pPr>
@@ -6442,9 +6677,9 @@
       </w:tcPr>
     </w:tblStylePr>
   </w:style>
-  <w:style w:type="table" w:styleId="43">
+  <w:style w:type="table" w:styleId="44">
     <w:name w:val="Light List Accent 2"/>
-    <w:basedOn w:val="32"/>
+    <w:basedOn w:val="33"/>
     <w:qFormat/>
     <w:uiPriority w:val="61"/>
     <w:pPr>
@@ -6536,9 +6771,9 @@
       </w:tcPr>
     </w:tblStylePr>
   </w:style>
-  <w:style w:type="table" w:styleId="44">
+  <w:style w:type="table" w:styleId="45">
     <w:name w:val="Light List Accent 3"/>
-    <w:basedOn w:val="32"/>
+    <w:basedOn w:val="33"/>
     <w:qFormat/>
     <w:uiPriority w:val="61"/>
     <w:pPr>
@@ -6630,9 +6865,9 @@
       </w:tcPr>
     </w:tblStylePr>
   </w:style>
-  <w:style w:type="table" w:styleId="45">
+  <w:style w:type="table" w:styleId="46">
     <w:name w:val="Light List Accent 4"/>
-    <w:basedOn w:val="32"/>
+    <w:basedOn w:val="33"/>
     <w:qFormat/>
     <w:uiPriority w:val="61"/>
     <w:pPr>
@@ -6724,9 +6959,9 @@
       </w:tcPr>
     </w:tblStylePr>
   </w:style>
-  <w:style w:type="table" w:styleId="46">
+  <w:style w:type="table" w:styleId="47">
     <w:name w:val="Light List Accent 5"/>
-    <w:basedOn w:val="32"/>
+    <w:basedOn w:val="33"/>
     <w:qFormat/>
     <w:uiPriority w:val="61"/>
     <w:pPr>
@@ -6818,9 +7053,9 @@
       </w:tcPr>
     </w:tblStylePr>
   </w:style>
-  <w:style w:type="table" w:styleId="47">
+  <w:style w:type="table" w:styleId="48">
     <w:name w:val="Light List Accent 6"/>
-    <w:basedOn w:val="32"/>
+    <w:basedOn w:val="33"/>
     <w:qFormat/>
     <w:uiPriority w:val="61"/>
     <w:pPr>
@@ -6912,9 +7147,9 @@
       </w:tcPr>
     </w:tblStylePr>
   </w:style>
-  <w:style w:type="table" w:styleId="48">
+  <w:style w:type="table" w:styleId="49">
     <w:name w:val="Light Grid"/>
-    <w:basedOn w:val="32"/>
+    <w:basedOn w:val="33"/>
     <w:qFormat/>
     <w:uiPriority w:val="62"/>
     <w:pPr>
@@ -7039,9 +7274,10 @@
       </w:tcPr>
     </w:tblStylePr>
   </w:style>
-  <w:style w:type="table" w:styleId="49">
+  <w:style w:type="table" w:styleId="50">
     <w:name w:val="Light Grid Accent 1"/>
-    <w:basedOn w:val="32"/>
+    <w:basedOn w:val="33"/>
+    <w:qFormat/>
     <w:uiPriority w:val="62"/>
     <w:pPr>
       <w:spacing w:after="0" w:line="240" w:lineRule="auto"/>
@@ -7165,9 +7401,9 @@
       </w:tcPr>
     </w:tblStylePr>
   </w:style>
-  <w:style w:type="table" w:styleId="50">
+  <w:style w:type="table" w:styleId="51">
     <w:name w:val="Light Grid Accent 2"/>
-    <w:basedOn w:val="32"/>
+    <w:basedOn w:val="33"/>
     <w:qFormat/>
     <w:uiPriority w:val="62"/>
     <w:pPr>
@@ -7292,9 +7528,10 @@
       </w:tcPr>
     </w:tblStylePr>
   </w:style>
-  <w:style w:type="table" w:styleId="51">
+  <w:style w:type="table" w:styleId="52">
     <w:name w:val="Light Grid Accent 3"/>
-    <w:basedOn w:val="32"/>
+    <w:basedOn w:val="33"/>
+    <w:qFormat/>
     <w:uiPriority w:val="62"/>
     <w:pPr>
       <w:spacing w:after="0" w:line="240" w:lineRule="auto"/>
@@ -7418,9 +7655,9 @@
       </w:tcPr>
     </w:tblStylePr>
   </w:style>
-  <w:style w:type="table" w:styleId="52">
+  <w:style w:type="table" w:styleId="53">
     <w:name w:val="Light Grid Accent 4"/>
-    <w:basedOn w:val="32"/>
+    <w:basedOn w:val="33"/>
     <w:qFormat/>
     <w:uiPriority w:val="62"/>
     <w:pPr>
@@ -7545,9 +7782,10 @@
       </w:tcPr>
     </w:tblStylePr>
   </w:style>
-  <w:style w:type="table" w:styleId="53">
+  <w:style w:type="table" w:styleId="54">
     <w:name w:val="Light Grid Accent 5"/>
-    <w:basedOn w:val="32"/>
+    <w:basedOn w:val="33"/>
+    <w:qFormat/>
     <w:uiPriority w:val="62"/>
     <w:pPr>
       <w:spacing w:after="0" w:line="240" w:lineRule="auto"/>
@@ -7671,9 +7909,9 @@
       </w:tcPr>
     </w:tblStylePr>
   </w:style>
-  <w:style w:type="table" w:styleId="54">
+  <w:style w:type="table" w:styleId="55">
     <w:name w:val="Light Grid Accent 6"/>
-    <w:basedOn w:val="32"/>
+    <w:basedOn w:val="33"/>
     <w:qFormat/>
     <w:uiPriority w:val="62"/>
     <w:pPr>
@@ -7798,9 +8036,10 @@
       </w:tcPr>
     </w:tblStylePr>
   </w:style>
-  <w:style w:type="table" w:styleId="55">
+  <w:style w:type="table" w:styleId="56">
     <w:name w:val="Medium Shading 1"/>
-    <w:basedOn w:val="32"/>
+    <w:basedOn w:val="33"/>
+    <w:qFormat/>
     <w:uiPriority w:val="63"/>
     <w:pPr>
       <w:spacing w:after="0" w:line="240" w:lineRule="auto"/>
@@ -7905,9 +8144,9 @@
       </w:tcPr>
     </w:tblStylePr>
   </w:style>
-  <w:style w:type="table" w:styleId="56">
+  <w:style w:type="table" w:styleId="57">
     <w:name w:val="Medium Shading 1 Accent 1"/>
-    <w:basedOn w:val="32"/>
+    <w:basedOn w:val="33"/>
     <w:qFormat/>
     <w:uiPriority w:val="63"/>
     <w:pPr>
@@ -8013,9 +8252,10 @@
       </w:tcPr>
     </w:tblStylePr>
   </w:style>
-  <w:style w:type="table" w:styleId="57">
+  <w:style w:type="table" w:styleId="58">
     <w:name w:val="Medium Shading 1 Accent 2"/>
-    <w:basedOn w:val="32"/>
+    <w:basedOn w:val="33"/>
+    <w:qFormat/>
     <w:uiPriority w:val="63"/>
     <w:pPr>
       <w:spacing w:after="0" w:line="240" w:lineRule="auto"/>
@@ -8120,9 +8360,10 @@
       </w:tcPr>
     </w:tblStylePr>
   </w:style>
-  <w:style w:type="table" w:styleId="58">
+  <w:style w:type="table" w:styleId="59">
     <w:name w:val="Medium Shading 1 Accent 3"/>
-    <w:basedOn w:val="32"/>
+    <w:basedOn w:val="33"/>
+    <w:qFormat/>
     <w:uiPriority w:val="63"/>
     <w:pPr>
       <w:spacing w:after="0" w:line="240" w:lineRule="auto"/>
@@ -8227,9 +8468,10 @@
       </w:tcPr>
     </w:tblStylePr>
   </w:style>
-  <w:style w:type="table" w:styleId="59">
+  <w:style w:type="table" w:styleId="60">
     <w:name w:val="Medium Shading 1 Accent 4"/>
-    <w:basedOn w:val="32"/>
+    <w:basedOn w:val="33"/>
+    <w:qFormat/>
     <w:uiPriority w:val="63"/>
     <w:pPr>
       <w:spacing w:after="0" w:line="240" w:lineRule="auto"/>
@@ -8334,9 +8576,9 @@
       </w:tcPr>
     </w:tblStylePr>
   </w:style>
-  <w:style w:type="table" w:styleId="60">
+  <w:style w:type="table" w:styleId="61">
     <w:name w:val="Medium Shading 1 Accent 5"/>
-    <w:basedOn w:val="32"/>
+    <w:basedOn w:val="33"/>
     <w:qFormat/>
     <w:uiPriority w:val="63"/>
     <w:pPr>
@@ -8442,9 +8684,9 @@
       </w:tcPr>
     </w:tblStylePr>
   </w:style>
-  <w:style w:type="table" w:styleId="61">
+  <w:style w:type="table" w:styleId="62">
     <w:name w:val="Medium Shading 1 Accent 6"/>
-    <w:basedOn w:val="32"/>
+    <w:basedOn w:val="33"/>
     <w:qFormat/>
     <w:uiPriority w:val="63"/>
     <w:pPr>
@@ -8550,9 +8792,9 @@
       </w:tcPr>
     </w:tblStylePr>
   </w:style>
-  <w:style w:type="table" w:styleId="62">
+  <w:style w:type="table" w:styleId="63">
     <w:name w:val="Medium Shading 2"/>
-    <w:basedOn w:val="32"/>
+    <w:basedOn w:val="33"/>
     <w:qFormat/>
     <w:uiPriority w:val="64"/>
     <w:pPr>
@@ -8716,9 +8958,10 @@
       </w:tcPr>
     </w:tblStylePr>
   </w:style>
-  <w:style w:type="table" w:styleId="63">
+  <w:style w:type="table" w:styleId="64">
     <w:name w:val="Medium Shading 2 Accent 1"/>
-    <w:basedOn w:val="32"/>
+    <w:basedOn w:val="33"/>
+    <w:qFormat/>
     <w:uiPriority w:val="64"/>
     <w:pPr>
       <w:spacing w:after="0" w:line="240" w:lineRule="auto"/>
@@ -8881,9 +9124,10 @@
       </w:tcPr>
     </w:tblStylePr>
   </w:style>
-  <w:style w:type="table" w:styleId="64">
+  <w:style w:type="table" w:styleId="65">
     <w:name w:val="Medium Shading 2 Accent 2"/>
-    <w:basedOn w:val="32"/>
+    <w:basedOn w:val="33"/>
+    <w:qFormat/>
     <w:uiPriority w:val="64"/>
     <w:pPr>
       <w:spacing w:after="0" w:line="240" w:lineRule="auto"/>
@@ -9046,9 +9290,10 @@
       </w:tcPr>
     </w:tblStylePr>
   </w:style>
-  <w:style w:type="table" w:styleId="65">
+  <w:style w:type="table" w:styleId="66">
     <w:name w:val="Medium Shading 2 Accent 3"/>
-    <w:basedOn w:val="32"/>
+    <w:basedOn w:val="33"/>
+    <w:qFormat/>
     <w:uiPriority w:val="64"/>
     <w:pPr>
       <w:spacing w:after="0" w:line="240" w:lineRule="auto"/>
@@ -9211,9 +9456,10 @@
       </w:tcPr>
     </w:tblStylePr>
   </w:style>
-  <w:style w:type="table" w:styleId="66">
+  <w:style w:type="table" w:styleId="67">
     <w:name w:val="Medium Shading 2 Accent 4"/>
-    <w:basedOn w:val="32"/>
+    <w:basedOn w:val="33"/>
+    <w:qFormat/>
     <w:uiPriority w:val="64"/>
     <w:pPr>
       <w:spacing w:after="0" w:line="240" w:lineRule="auto"/>
@@ -9376,9 +9622,10 @@
       </w:tcPr>
     </w:tblStylePr>
   </w:style>
-  <w:style w:type="table" w:styleId="67">
+  <w:style w:type="table" w:styleId="68">
     <w:name w:val="Medium Shading 2 Accent 5"/>
-    <w:basedOn w:val="32"/>
+    <w:basedOn w:val="33"/>
+    <w:qFormat/>
     <w:uiPriority w:val="64"/>
     <w:pPr>
       <w:spacing w:after="0" w:line="240" w:lineRule="auto"/>
@@ -9541,9 +9788,10 @@
       </w:tcPr>
     </w:tblStylePr>
   </w:style>
-  <w:style w:type="table" w:styleId="68">
+  <w:style w:type="table" w:styleId="69">
     <w:name w:val="Medium Shading 2 Accent 6"/>
-    <w:basedOn w:val="32"/>
+    <w:basedOn w:val="33"/>
+    <w:qFormat/>
     <w:uiPriority w:val="64"/>
     <w:pPr>
       <w:spacing w:after="0" w:line="240" w:lineRule="auto"/>
@@ -9706,9 +9954,10 @@
       </w:tcPr>
     </w:tblStylePr>
   </w:style>
-  <w:style w:type="table" w:styleId="69">
+  <w:style w:type="table" w:styleId="70">
     <w:name w:val="Medium List 1"/>
-    <w:basedOn w:val="32"/>
+    <w:basedOn w:val="33"/>
+    <w:qFormat/>
     <w:uiPriority w:val="65"/>
     <w:pPr>
       <w:spacing w:after="0" w:line="240" w:lineRule="auto"/>
@@ -9796,9 +10045,10 @@
       </w:tcPr>
     </w:tblStylePr>
   </w:style>
-  <w:style w:type="table" w:styleId="70">
+  <w:style w:type="table" w:styleId="71">
     <w:name w:val="Medium List 1 Accent 1"/>
-    <w:basedOn w:val="32"/>
+    <w:basedOn w:val="33"/>
+    <w:qFormat/>
     <w:uiPriority w:val="65"/>
     <w:pPr>
       <w:spacing w:after="0" w:line="240" w:lineRule="auto"/>
@@ -9886,9 +10136,10 @@
       </w:tcPr>
     </w:tblStylePr>
   </w:style>
-  <w:style w:type="table" w:styleId="71">
+  <w:style w:type="table" w:styleId="72">
     <w:name w:val="Medium List 1 Accent 2"/>
-    <w:basedOn w:val="32"/>
+    <w:basedOn w:val="33"/>
+    <w:qFormat/>
     <w:uiPriority w:val="65"/>
     <w:pPr>
       <w:spacing w:after="0" w:line="240" w:lineRule="auto"/>
@@ -9976,9 +10227,9 @@
       </w:tcPr>
     </w:tblStylePr>
   </w:style>
-  <w:style w:type="table" w:styleId="72">
+  <w:style w:type="table" w:styleId="73">
     <w:name w:val="Medium List 1 Accent 3"/>
-    <w:basedOn w:val="32"/>
+    <w:basedOn w:val="33"/>
     <w:qFormat/>
     <w:uiPriority w:val="65"/>
     <w:pPr>
@@ -10067,9 +10318,10 @@
       </w:tcPr>
     </w:tblStylePr>
   </w:style>
-  <w:style w:type="table" w:styleId="73">
+  <w:style w:type="table" w:styleId="74">
     <w:name w:val="Medium List 1 Accent 4"/>
-    <w:basedOn w:val="32"/>
+    <w:basedOn w:val="33"/>
+    <w:qFormat/>
     <w:uiPriority w:val="65"/>
     <w:pPr>
       <w:spacing w:after="0" w:line="240" w:lineRule="auto"/>
@@ -10157,9 +10409,10 @@
       </w:tcPr>
     </w:tblStylePr>
   </w:style>
-  <w:style w:type="table" w:styleId="74">
+  <w:style w:type="table" w:styleId="75">
     <w:name w:val="Medium List 1 Accent 5"/>
-    <w:basedOn w:val="32"/>
+    <w:basedOn w:val="33"/>
+    <w:qFormat/>
     <w:uiPriority w:val="65"/>
     <w:pPr>
       <w:spacing w:after="0" w:line="240" w:lineRule="auto"/>
@@ -10247,9 +10500,10 @@
       </w:tcPr>
     </w:tblStylePr>
   </w:style>
-  <w:style w:type="table" w:styleId="75">
+  <w:style w:type="table" w:styleId="76">
     <w:name w:val="Medium List 1 Accent 6"/>
-    <w:basedOn w:val="32"/>
+    <w:basedOn w:val="33"/>
+    <w:qFormat/>
     <w:uiPriority w:val="65"/>
     <w:pPr>
       <w:spacing w:after="0" w:line="240" w:lineRule="auto"/>
@@ -10337,9 +10591,10 @@
       </w:tcPr>
     </w:tblStylePr>
   </w:style>
-  <w:style w:type="table" w:styleId="76">
+  <w:style w:type="table" w:styleId="77">
     <w:name w:val="Medium List 2"/>
-    <w:basedOn w:val="32"/>
+    <w:basedOn w:val="33"/>
+    <w:qFormat/>
     <w:uiPriority w:val="66"/>
     <w:pPr>
       <w:spacing w:after="0" w:line="240" w:lineRule="auto"/>
@@ -10466,9 +10721,9 @@
       </w:tcPr>
     </w:tblStylePr>
   </w:style>
-  <w:style w:type="table" w:styleId="77">
+  <w:style w:type="table" w:styleId="78">
     <w:name w:val="Medium List 2 Accent 1"/>
-    <w:basedOn w:val="32"/>
+    <w:basedOn w:val="33"/>
     <w:qFormat/>
     <w:uiPriority w:val="66"/>
     <w:pPr>
@@ -10596,9 +10851,10 @@
       </w:tcPr>
     </w:tblStylePr>
   </w:style>
-  <w:style w:type="table" w:styleId="78">
+  <w:style w:type="table" w:styleId="79">
     <w:name w:val="Medium List 2 Accent 2"/>
-    <w:basedOn w:val="32"/>
+    <w:basedOn w:val="33"/>
+    <w:qFormat/>
     <w:uiPriority w:val="66"/>
     <w:pPr>
       <w:spacing w:after="0" w:line="240" w:lineRule="auto"/>
@@ -10725,9 +10981,9 @@
       </w:tcPr>
     </w:tblStylePr>
   </w:style>
-  <w:style w:type="table" w:styleId="79">
+  <w:style w:type="table" w:styleId="80">
     <w:name w:val="Medium List 2 Accent 3"/>
-    <w:basedOn w:val="32"/>
+    <w:basedOn w:val="33"/>
     <w:qFormat/>
     <w:uiPriority w:val="66"/>
     <w:pPr>
@@ -10855,9 +11111,10 @@
       </w:tcPr>
     </w:tblStylePr>
   </w:style>
-  <w:style w:type="table" w:styleId="80">
+  <w:style w:type="table" w:styleId="81">
     <w:name w:val="Medium List 2 Accent 4"/>
-    <w:basedOn w:val="32"/>
+    <w:basedOn w:val="33"/>
+    <w:qFormat/>
     <w:uiPriority w:val="66"/>
     <w:pPr>
       <w:spacing w:after="0" w:line="240" w:lineRule="auto"/>
@@ -10984,9 +11241,9 @@
       </w:tcPr>
     </w:tblStylePr>
   </w:style>
-  <w:style w:type="table" w:styleId="81">
+  <w:style w:type="table" w:styleId="82">
     <w:name w:val="Medium List 2 Accent 5"/>
-    <w:basedOn w:val="32"/>
+    <w:basedOn w:val="33"/>
     <w:qFormat/>
     <w:uiPriority w:val="66"/>
     <w:pPr>
@@ -11114,9 +11371,10 @@
       </w:tcPr>
     </w:tblStylePr>
   </w:style>
-  <w:style w:type="table" w:styleId="82">
+  <w:style w:type="table" w:styleId="83">
     <w:name w:val="Medium List 2 Accent 6"/>
-    <w:basedOn w:val="32"/>
+    <w:basedOn w:val="33"/>
+    <w:qFormat/>
     <w:uiPriority w:val="66"/>
     <w:pPr>
       <w:spacing w:after="0" w:line="240" w:lineRule="auto"/>
@@ -11243,9 +11501,10 @@
       </w:tcPr>
     </w:tblStylePr>
   </w:style>
-  <w:style w:type="table" w:styleId="83">
+  <w:style w:type="table" w:styleId="84">
     <w:name w:val="Medium Grid 1"/>
-    <w:basedOn w:val="32"/>
+    <w:basedOn w:val="33"/>
+    <w:qFormat/>
     <w:uiPriority w:val="67"/>
     <w:pPr>
       <w:spacing w:after="0" w:line="240" w:lineRule="auto"/>
@@ -11312,9 +11571,9 @@
       </w:tcPr>
     </w:tblStylePr>
   </w:style>
-  <w:style w:type="table" w:styleId="84">
+  <w:style w:type="table" w:styleId="85">
     <w:name w:val="Medium Grid 1 Accent 1"/>
-    <w:basedOn w:val="32"/>
+    <w:basedOn w:val="33"/>
     <w:qFormat/>
     <w:uiPriority w:val="67"/>
     <w:pPr>
@@ -11382,9 +11641,9 @@
       </w:tcPr>
     </w:tblStylePr>
   </w:style>
-  <w:style w:type="table" w:styleId="85">
+  <w:style w:type="table" w:styleId="86">
     <w:name w:val="Medium Grid 1 Accent 2"/>
-    <w:basedOn w:val="32"/>
+    <w:basedOn w:val="33"/>
     <w:qFormat/>
     <w:uiPriority w:val="67"/>
     <w:pPr>
@@ -11452,9 +11711,9 @@
       </w:tcPr>
     </w:tblStylePr>
   </w:style>
-  <w:style w:type="table" w:styleId="86">
+  <w:style w:type="table" w:styleId="87">
     <w:name w:val="Medium Grid 1 Accent 3"/>
-    <w:basedOn w:val="32"/>
+    <w:basedOn w:val="33"/>
     <w:qFormat/>
     <w:uiPriority w:val="67"/>
     <w:pPr>
@@ -11522,9 +11781,9 @@
       </w:tcPr>
     </w:tblStylePr>
   </w:style>
-  <w:style w:type="table" w:styleId="87">
+  <w:style w:type="table" w:styleId="88">
     <w:name w:val="Medium Grid 1 Accent 4"/>
-    <w:basedOn w:val="32"/>
+    <w:basedOn w:val="33"/>
     <w:qFormat/>
     <w:uiPriority w:val="67"/>
     <w:pPr>
@@ -11592,9 +11851,9 @@
       </w:tcPr>
     </w:tblStylePr>
   </w:style>
-  <w:style w:type="table" w:styleId="88">
+  <w:style w:type="table" w:styleId="89">
     <w:name w:val="Medium Grid 1 Accent 5"/>
-    <w:basedOn w:val="32"/>
+    <w:basedOn w:val="33"/>
     <w:qFormat/>
     <w:uiPriority w:val="67"/>
     <w:pPr>
@@ -11662,9 +11921,9 @@
       </w:tcPr>
     </w:tblStylePr>
   </w:style>
-  <w:style w:type="table" w:styleId="89">
+  <w:style w:type="table" w:styleId="90">
     <w:name w:val="Medium Grid 1 Accent 6"/>
-    <w:basedOn w:val="32"/>
+    <w:basedOn w:val="33"/>
     <w:qFormat/>
     <w:uiPriority w:val="67"/>
     <w:pPr>
@@ -11732,9 +11991,9 @@
       </w:tcPr>
     </w:tblStylePr>
   </w:style>
-  <w:style w:type="table" w:styleId="90">
+  <w:style w:type="table" w:styleId="91">
     <w:name w:val="Medium Grid 2"/>
-    <w:basedOn w:val="32"/>
+    <w:basedOn w:val="33"/>
     <w:qFormat/>
     <w:uiPriority w:val="68"/>
     <w:pPr>
@@ -11879,9 +12138,9 @@
       </w:tcPr>
     </w:tblStylePr>
   </w:style>
-  <w:style w:type="table" w:styleId="91">
+  <w:style w:type="table" w:styleId="92">
     <w:name w:val="Medium Grid 2 Accent 1"/>
-    <w:basedOn w:val="32"/>
+    <w:basedOn w:val="33"/>
     <w:qFormat/>
     <w:uiPriority w:val="68"/>
     <w:pPr>
@@ -12026,9 +12285,9 @@
       </w:tcPr>
     </w:tblStylePr>
   </w:style>
-  <w:style w:type="table" w:styleId="92">
+  <w:style w:type="table" w:styleId="93">
     <w:name w:val="Medium Grid 2 Accent 2"/>
-    <w:basedOn w:val="32"/>
+    <w:basedOn w:val="33"/>
     <w:qFormat/>
     <w:uiPriority w:val="68"/>
     <w:pPr>
@@ -12173,9 +12432,9 @@
       </w:tcPr>
     </w:tblStylePr>
   </w:style>
-  <w:style w:type="table" w:styleId="93">
+  <w:style w:type="table" w:styleId="94">
     <w:name w:val="Medium Grid 2 Accent 3"/>
-    <w:basedOn w:val="32"/>
+    <w:basedOn w:val="33"/>
     <w:qFormat/>
     <w:uiPriority w:val="68"/>
     <w:pPr>
@@ -12320,9 +12579,9 @@
       </w:tcPr>
     </w:tblStylePr>
   </w:style>
-  <w:style w:type="table" w:styleId="94">
+  <w:style w:type="table" w:styleId="95">
     <w:name w:val="Medium Grid 2 Accent 4"/>
-    <w:basedOn w:val="32"/>
+    <w:basedOn w:val="33"/>
     <w:qFormat/>
     <w:uiPriority w:val="68"/>
     <w:pPr>
@@ -12467,9 +12726,9 @@
       </w:tcPr>
     </w:tblStylePr>
   </w:style>
-  <w:style w:type="table" w:styleId="95">
+  <w:style w:type="table" w:styleId="96">
     <w:name w:val="Medium Grid 2 Accent 5"/>
-    <w:basedOn w:val="32"/>
+    <w:basedOn w:val="33"/>
     <w:qFormat/>
     <w:uiPriority w:val="68"/>
     <w:pPr>
@@ -12614,9 +12873,9 @@
       </w:tcPr>
     </w:tblStylePr>
   </w:style>
-  <w:style w:type="table" w:styleId="96">
+  <w:style w:type="table" w:styleId="97">
     <w:name w:val="Medium Grid 2 Accent 6"/>
-    <w:basedOn w:val="32"/>
+    <w:basedOn w:val="33"/>
     <w:qFormat/>
     <w:uiPriority w:val="68"/>
     <w:pPr>
@@ -12761,9 +13020,9 @@
       </w:tcPr>
     </w:tblStylePr>
   </w:style>
-  <w:style w:type="table" w:styleId="97">
+  <w:style w:type="table" w:styleId="98">
     <w:name w:val="Medium Grid 3"/>
-    <w:basedOn w:val="32"/>
+    <w:basedOn w:val="33"/>
     <w:qFormat/>
     <w:uiPriority w:val="69"/>
     <w:pPr>
@@ -12919,9 +13178,9 @@
       </w:tcPr>
     </w:tblStylePr>
   </w:style>
-  <w:style w:type="table" w:styleId="98">
+  <w:style w:type="table" w:styleId="99">
     <w:name w:val="Medium Grid 3 Accent 1"/>
-    <w:basedOn w:val="32"/>
+    <w:basedOn w:val="33"/>
     <w:qFormat/>
     <w:uiPriority w:val="69"/>
     <w:pPr>
@@ -13077,9 +13336,9 @@
       </w:tcPr>
     </w:tblStylePr>
   </w:style>
-  <w:style w:type="table" w:styleId="99">
+  <w:style w:type="table" w:styleId="100">
     <w:name w:val="Medium Grid 3 Accent 2"/>
-    <w:basedOn w:val="32"/>
+    <w:basedOn w:val="33"/>
     <w:qFormat/>
     <w:uiPriority w:val="69"/>
     <w:pPr>
@@ -13235,9 +13494,9 @@
       </w:tcPr>
     </w:tblStylePr>
   </w:style>
-  <w:style w:type="table" w:styleId="100">
+  <w:style w:type="table" w:styleId="101">
     <w:name w:val="Medium Grid 3 Accent 3"/>
-    <w:basedOn w:val="32"/>
+    <w:basedOn w:val="33"/>
     <w:qFormat/>
     <w:uiPriority w:val="69"/>
     <w:pPr>
@@ -13393,9 +13652,9 @@
       </w:tcPr>
     </w:tblStylePr>
   </w:style>
-  <w:style w:type="table" w:styleId="101">
+  <w:style w:type="table" w:styleId="102">
     <w:name w:val="Medium Grid 3 Accent 4"/>
-    <w:basedOn w:val="32"/>
+    <w:basedOn w:val="33"/>
     <w:qFormat/>
     <w:uiPriority w:val="69"/>
     <w:pPr>
@@ -13551,9 +13810,9 @@
       </w:tcPr>
     </w:tblStylePr>
   </w:style>
-  <w:style w:type="table" w:styleId="102">
+  <w:style w:type="table" w:styleId="103">
     <w:name w:val="Medium Grid 3 Accent 5"/>
-    <w:basedOn w:val="32"/>
+    <w:basedOn w:val="33"/>
     <w:qFormat/>
     <w:uiPriority w:val="69"/>
     <w:pPr>
@@ -13709,9 +13968,9 @@
       </w:tcPr>
     </w:tblStylePr>
   </w:style>
-  <w:style w:type="table" w:styleId="103">
+  <w:style w:type="table" w:styleId="104">
     <w:name w:val="Medium Grid 3 Accent 6"/>
-    <w:basedOn w:val="32"/>
+    <w:basedOn w:val="33"/>
     <w:qFormat/>
     <w:uiPriority w:val="69"/>
     <w:pPr>
@@ -13867,9 +14126,9 @@
       </w:tcPr>
     </w:tblStylePr>
   </w:style>
-  <w:style w:type="table" w:styleId="104">
+  <w:style w:type="table" w:styleId="105">
     <w:name w:val="Dark List"/>
-    <w:basedOn w:val="32"/>
+    <w:basedOn w:val="33"/>
     <w:qFormat/>
     <w:uiPriority w:val="70"/>
     <w:pPr>
@@ -13983,9 +14242,9 @@
       </w:tcPr>
     </w:tblStylePr>
   </w:style>
-  <w:style w:type="table" w:styleId="105">
+  <w:style w:type="table" w:styleId="106">
     <w:name w:val="Dark List Accent 1"/>
-    <w:basedOn w:val="32"/>
+    <w:basedOn w:val="33"/>
     <w:qFormat/>
     <w:uiPriority w:val="70"/>
     <w:pPr>
@@ -14099,9 +14358,9 @@
       </w:tcPr>
     </w:tblStylePr>
   </w:style>
-  <w:style w:type="table" w:styleId="106">
+  <w:style w:type="table" w:styleId="107">
     <w:name w:val="Dark List Accent 2"/>
-    <w:basedOn w:val="32"/>
+    <w:basedOn w:val="33"/>
     <w:qFormat/>
     <w:uiPriority w:val="70"/>
     <w:pPr>
@@ -14215,9 +14474,9 @@
       </w:tcPr>
     </w:tblStylePr>
   </w:style>
-  <w:style w:type="table" w:styleId="107">
+  <w:style w:type="table" w:styleId="108">
     <w:name w:val="Dark List Accent 3"/>
-    <w:basedOn w:val="32"/>
+    <w:basedOn w:val="33"/>
     <w:qFormat/>
     <w:uiPriority w:val="70"/>
     <w:pPr>
@@ -14331,9 +14590,9 @@
       </w:tcPr>
     </w:tblStylePr>
   </w:style>
-  <w:style w:type="table" w:styleId="108">
+  <w:style w:type="table" w:styleId="109">
     <w:name w:val="Dark List Accent 4"/>
-    <w:basedOn w:val="32"/>
+    <w:basedOn w:val="33"/>
     <w:qFormat/>
     <w:uiPriority w:val="70"/>
     <w:pPr>
@@ -14447,9 +14706,9 @@
       </w:tcPr>
     </w:tblStylePr>
   </w:style>
-  <w:style w:type="table" w:styleId="109">
+  <w:style w:type="table" w:styleId="110">
     <w:name w:val="Dark List Accent 5"/>
-    <w:basedOn w:val="32"/>
+    <w:basedOn w:val="33"/>
     <w:qFormat/>
     <w:uiPriority w:val="70"/>
     <w:pPr>
@@ -14563,9 +14822,9 @@
       </w:tcPr>
     </w:tblStylePr>
   </w:style>
-  <w:style w:type="table" w:styleId="110">
+  <w:style w:type="table" w:styleId="111">
     <w:name w:val="Dark List Accent 6"/>
-    <w:basedOn w:val="32"/>
+    <w:basedOn w:val="33"/>
     <w:qFormat/>
     <w:uiPriority w:val="70"/>
     <w:pPr>
@@ -14679,9 +14938,10 @@
       </w:tcPr>
     </w:tblStylePr>
   </w:style>
-  <w:style w:type="table" w:styleId="111">
+  <w:style w:type="table" w:styleId="112">
     <w:name w:val="Colorful Shading"/>
-    <w:basedOn w:val="32"/>
+    <w:basedOn w:val="33"/>
+    <w:qFormat/>
     <w:uiPriority w:val="71"/>
     <w:pPr>
       <w:spacing w:after="0" w:line="240" w:lineRule="auto"/>
@@ -14827,9 +15087,9 @@
       </w:rPr>
     </w:tblStylePr>
   </w:style>
-  <w:style w:type="table" w:styleId="112">
+  <w:style w:type="table" w:styleId="113">
     <w:name w:val="Colorful Shading Accent 1"/>
-    <w:basedOn w:val="32"/>
+    <w:basedOn w:val="33"/>
     <w:qFormat/>
     <w:uiPriority w:val="71"/>
     <w:pPr>
@@ -14976,9 +15236,9 @@
       </w:rPr>
     </w:tblStylePr>
   </w:style>
-  <w:style w:type="table" w:styleId="113">
+  <w:style w:type="table" w:styleId="114">
     <w:name w:val="Colorful Shading Accent 2"/>
-    <w:basedOn w:val="32"/>
+    <w:basedOn w:val="33"/>
     <w:qFormat/>
     <w:uiPriority w:val="71"/>
     <w:pPr>
@@ -15125,9 +15385,10 @@
       </w:rPr>
     </w:tblStylePr>
   </w:style>
-  <w:style w:type="table" w:styleId="114">
+  <w:style w:type="table" w:styleId="115">
     <w:name w:val="Colorful Shading Accent 3"/>
-    <w:basedOn w:val="32"/>
+    <w:basedOn w:val="33"/>
+    <w:qFormat/>
     <w:uiPriority w:val="71"/>
     <w:pPr>
       <w:spacing w:after="0" w:line="240" w:lineRule="auto"/>
@@ -15253,9 +15514,9 @@
       </w:tcPr>
     </w:tblStylePr>
   </w:style>
-  <w:style w:type="table" w:styleId="115">
+  <w:style w:type="table" w:styleId="116">
     <w:name w:val="Colorful Shading Accent 4"/>
-    <w:basedOn w:val="32"/>
+    <w:basedOn w:val="33"/>
     <w:qFormat/>
     <w:uiPriority w:val="71"/>
     <w:pPr>
@@ -15402,9 +15663,9 @@
       </w:rPr>
     </w:tblStylePr>
   </w:style>
-  <w:style w:type="table" w:styleId="116">
+  <w:style w:type="table" w:styleId="117">
     <w:name w:val="Colorful Shading Accent 5"/>
-    <w:basedOn w:val="32"/>
+    <w:basedOn w:val="33"/>
     <w:qFormat/>
     <w:uiPriority w:val="71"/>
     <w:pPr>
@@ -15551,9 +15812,10 @@
       </w:rPr>
     </w:tblStylePr>
   </w:style>
-  <w:style w:type="table" w:styleId="117">
+  <w:style w:type="table" w:styleId="118">
     <w:name w:val="Colorful Shading Accent 6"/>
-    <w:basedOn w:val="32"/>
+    <w:basedOn w:val="33"/>
+    <w:qFormat/>
     <w:uiPriority w:val="71"/>
     <w:pPr>
       <w:spacing w:after="0" w:line="240" w:lineRule="auto"/>
@@ -15699,9 +15961,9 @@
       </w:rPr>
     </w:tblStylePr>
   </w:style>
-  <w:style w:type="table" w:styleId="118">
+  <w:style w:type="table" w:styleId="119">
     <w:name w:val="Colorful List"/>
-    <w:basedOn w:val="32"/>
+    <w:basedOn w:val="33"/>
     <w:qFormat/>
     <w:uiPriority w:val="72"/>
     <w:pPr>
@@ -15792,9 +16054,9 @@
       </w:tcPr>
     </w:tblStylePr>
   </w:style>
-  <w:style w:type="table" w:styleId="119">
+  <w:style w:type="table" w:styleId="120">
     <w:name w:val="Colorful List Accent 1"/>
-    <w:basedOn w:val="32"/>
+    <w:basedOn w:val="33"/>
     <w:qFormat/>
     <w:uiPriority w:val="72"/>
     <w:pPr>
@@ -15885,9 +16147,10 @@
       </w:tcPr>
     </w:tblStylePr>
   </w:style>
-  <w:style w:type="table" w:styleId="120">
+  <w:style w:type="table" w:styleId="121">
     <w:name w:val="Colorful List Accent 2"/>
-    <w:basedOn w:val="32"/>
+    <w:basedOn w:val="33"/>
+    <w:qFormat/>
     <w:uiPriority w:val="72"/>
     <w:pPr>
       <w:spacing w:after="0" w:line="240" w:lineRule="auto"/>
@@ -15977,9 +16240,9 @@
       </w:tcPr>
     </w:tblStylePr>
   </w:style>
-  <w:style w:type="table" w:styleId="121">
+  <w:style w:type="table" w:styleId="122">
     <w:name w:val="Colorful List Accent 3"/>
-    <w:basedOn w:val="32"/>
+    <w:basedOn w:val="33"/>
     <w:qFormat/>
     <w:uiPriority w:val="72"/>
     <w:pPr>
@@ -16070,9 +16333,10 @@
       </w:tcPr>
     </w:tblStylePr>
   </w:style>
-  <w:style w:type="table" w:styleId="122">
+  <w:style w:type="table" w:styleId="123">
     <w:name w:val="Colorful List Accent 4"/>
-    <w:basedOn w:val="32"/>
+    <w:basedOn w:val="33"/>
+    <w:qFormat/>
     <w:uiPriority w:val="72"/>
     <w:pPr>
       <w:spacing w:after="0" w:line="240" w:lineRule="auto"/>
@@ -16162,9 +16426,9 @@
       </w:tcPr>
     </w:tblStylePr>
   </w:style>
-  <w:style w:type="table" w:styleId="123">
+  <w:style w:type="table" w:styleId="124">
     <w:name w:val="Colorful List Accent 5"/>
-    <w:basedOn w:val="32"/>
+    <w:basedOn w:val="33"/>
     <w:qFormat/>
     <w:uiPriority w:val="72"/>
     <w:pPr>
@@ -16255,9 +16519,9 @@
       </w:tcPr>
     </w:tblStylePr>
   </w:style>
-  <w:style w:type="table" w:styleId="124">
+  <w:style w:type="table" w:styleId="125">
     <w:name w:val="Colorful List Accent 6"/>
-    <w:basedOn w:val="32"/>
+    <w:basedOn w:val="33"/>
     <w:qFormat/>
     <w:uiPriority w:val="72"/>
     <w:pPr>
@@ -16348,9 +16612,9 @@
       </w:tcPr>
     </w:tblStylePr>
   </w:style>
-  <w:style w:type="table" w:styleId="125">
+  <w:style w:type="table" w:styleId="126">
     <w:name w:val="Colorful Grid"/>
-    <w:basedOn w:val="32"/>
+    <w:basedOn w:val="33"/>
     <w:qFormat/>
     <w:uiPriority w:val="73"/>
     <w:pPr>
@@ -16445,9 +16709,9 @@
       </w:tcPr>
     </w:tblStylePr>
   </w:style>
-  <w:style w:type="table" w:styleId="126">
+  <w:style w:type="table" w:styleId="127">
     <w:name w:val="Colorful Grid Accent 1"/>
-    <w:basedOn w:val="32"/>
+    <w:basedOn w:val="33"/>
     <w:qFormat/>
     <w:uiPriority w:val="73"/>
     <w:pPr>
@@ -16542,9 +16806,9 @@
       </w:tcPr>
     </w:tblStylePr>
   </w:style>
-  <w:style w:type="table" w:styleId="127">
+  <w:style w:type="table" w:styleId="128">
     <w:name w:val="Colorful Grid Accent 2"/>
-    <w:basedOn w:val="32"/>
+    <w:basedOn w:val="33"/>
     <w:qFormat/>
     <w:uiPriority w:val="73"/>
     <w:pPr>
@@ -16639,9 +16903,10 @@
       </w:tcPr>
     </w:tblStylePr>
   </w:style>
-  <w:style w:type="table" w:styleId="128">
+  <w:style w:type="table" w:styleId="129">
     <w:name w:val="Colorful Grid Accent 3"/>
-    <w:basedOn w:val="32"/>
+    <w:basedOn w:val="33"/>
+    <w:qFormat/>
     <w:uiPriority w:val="73"/>
     <w:pPr>
       <w:spacing w:after="0" w:line="240" w:lineRule="auto"/>
@@ -16735,9 +17000,10 @@
       </w:tcPr>
     </w:tblStylePr>
   </w:style>
-  <w:style w:type="table" w:styleId="129">
+  <w:style w:type="table" w:styleId="130">
     <w:name w:val="Colorful Grid Accent 4"/>
-    <w:basedOn w:val="32"/>
+    <w:basedOn w:val="33"/>
+    <w:qFormat/>
     <w:uiPriority w:val="73"/>
     <w:pPr>
       <w:spacing w:after="0" w:line="240" w:lineRule="auto"/>
@@ -16831,9 +17097,9 @@
       </w:tcPr>
     </w:tblStylePr>
   </w:style>
-  <w:style w:type="table" w:styleId="130">
+  <w:style w:type="table" w:styleId="131">
     <w:name w:val="Colorful Grid Accent 5"/>
-    <w:basedOn w:val="32"/>
+    <w:basedOn w:val="33"/>
     <w:qFormat/>
     <w:uiPriority w:val="73"/>
     <w:pPr>
@@ -16928,9 +17194,9 @@
       </w:tcPr>
     </w:tblStylePr>
   </w:style>
-  <w:style w:type="table" w:styleId="131">
+  <w:style w:type="table" w:styleId="132">
     <w:name w:val="Colorful Grid Accent 6"/>
-    <w:basedOn w:val="32"/>
+    <w:basedOn w:val="33"/>
     <w:qFormat/>
     <w:uiPriority w:val="73"/>
     <w:pPr>
@@ -17025,9 +17291,9 @@
       </w:tcPr>
     </w:tblStylePr>
   </w:style>
-  <w:style w:type="character" w:styleId="133">
+  <w:style w:type="character" w:styleId="134">
     <w:name w:val="Strong"/>
-    <w:basedOn w:val="132"/>
+    <w:basedOn w:val="133"/>
     <w:qFormat/>
     <w:uiPriority w:val="22"/>
     <w:rPr>
@@ -17035,9 +17301,9 @@
       <w:bCs/>
     </w:rPr>
   </w:style>
-  <w:style w:type="character" w:styleId="134">
+  <w:style w:type="character" w:styleId="135">
     <w:name w:val="Emphasis"/>
-    <w:basedOn w:val="132"/>
+    <w:basedOn w:val="133"/>
     <w:qFormat/>
     <w:uiPriority w:val="20"/>
     <w:rPr>
@@ -17045,31 +17311,33 @@
       <w:iCs/>
     </w:rPr>
   </w:style>
-  <w:style w:type="character" w:styleId="135">
+  <w:style w:type="character" w:styleId="136">
     <w:name w:val="HTML Code"/>
-    <w:basedOn w:val="132"/>
+    <w:basedOn w:val="133"/>
     <w:semiHidden/>
     <w:unhideWhenUsed/>
+    <w:qFormat/>
     <w:uiPriority w:val="99"/>
     <w:rPr>
       <w:rFonts w:ascii="Courier New" w:hAnsi="Courier New"/>
       <w:sz w:val="20"/>
     </w:rPr>
   </w:style>
-  <w:style w:type="character" w:customStyle="1" w:styleId="136">
+  <w:style w:type="character" w:customStyle="1" w:styleId="137">
     <w:name w:val="Header Char"/>
-    <w:basedOn w:val="132"/>
+    <w:basedOn w:val="133"/>
     <w:link w:val="25"/>
+    <w:qFormat/>
     <w:uiPriority w:val="99"/>
   </w:style>
-  <w:style w:type="character" w:customStyle="1" w:styleId="137">
+  <w:style w:type="character" w:customStyle="1" w:styleId="138">
     <w:name w:val="Footer Char"/>
-    <w:basedOn w:val="132"/>
+    <w:basedOn w:val="133"/>
     <w:link w:val="24"/>
     <w:qFormat/>
     <w:uiPriority w:val="99"/>
   </w:style>
-  <w:style w:type="paragraph" w:styleId="138">
+  <w:style w:type="paragraph" w:styleId="139">
     <w:name w:val="No Spacing"/>
     <w:qFormat/>
     <w:uiPriority w:val="1"/>
@@ -17083,10 +17351,11 @@
       <w:lang w:val="en-US" w:eastAsia="en-US" w:bidi="ar-SA"/>
     </w:rPr>
   </w:style>
-  <w:style w:type="character" w:customStyle="1" w:styleId="139">
+  <w:style w:type="character" w:customStyle="1" w:styleId="140">
     <w:name w:val="Heading 1 Char"/>
-    <w:basedOn w:val="132"/>
+    <w:basedOn w:val="133"/>
     <w:link w:val="3"/>
+    <w:qFormat/>
     <w:uiPriority w:val="9"/>
     <w:rPr>
       <w:rFonts w:asciiTheme="majorHAnsi" w:hAnsiTheme="majorHAnsi" w:eastAsiaTheme="majorEastAsia" w:cstheme="majorBidi"/>
@@ -17097,9 +17366,9 @@
       <w:szCs w:val="28"/>
     </w:rPr>
   </w:style>
-  <w:style w:type="character" w:customStyle="1" w:styleId="140">
+  <w:style w:type="character" w:customStyle="1" w:styleId="141">
     <w:name w:val="Heading 2 Char"/>
-    <w:basedOn w:val="132"/>
+    <w:basedOn w:val="133"/>
     <w:link w:val="4"/>
     <w:qFormat/>
     <w:uiPriority w:val="9"/>
@@ -17117,9 +17386,9 @@
       </w14:textFill>
     </w:rPr>
   </w:style>
-  <w:style w:type="character" w:customStyle="1" w:styleId="141">
+  <w:style w:type="character" w:customStyle="1" w:styleId="142">
     <w:name w:val="Heading 3 Char"/>
-    <w:basedOn w:val="132"/>
+    <w:basedOn w:val="133"/>
     <w:link w:val="5"/>
     <w:qFormat/>
     <w:uiPriority w:val="9"/>
@@ -17135,10 +17404,11 @@
       </w14:textFill>
     </w:rPr>
   </w:style>
-  <w:style w:type="character" w:customStyle="1" w:styleId="142">
+  <w:style w:type="character" w:customStyle="1" w:styleId="143">
     <w:name w:val="Title Char"/>
-    <w:basedOn w:val="132"/>
-    <w:link w:val="31"/>
+    <w:basedOn w:val="133"/>
+    <w:link w:val="32"/>
+    <w:qFormat/>
     <w:uiPriority w:val="10"/>
     <w:rPr>
       <w:rFonts w:asciiTheme="majorHAnsi" w:hAnsiTheme="majorHAnsi" w:eastAsiaTheme="majorEastAsia" w:cstheme="majorBidi"/>
@@ -17149,9 +17419,9 @@
       <w:szCs w:val="52"/>
     </w:rPr>
   </w:style>
-  <w:style w:type="character" w:customStyle="1" w:styleId="143">
+  <w:style w:type="character" w:customStyle="1" w:styleId="144">
     <w:name w:val="Subtitle Char"/>
-    <w:basedOn w:val="132"/>
+    <w:basedOn w:val="133"/>
     <w:link w:val="26"/>
     <w:qFormat/>
     <w:uiPriority w:val="11"/>
@@ -17170,7 +17440,7 @@
       </w14:textFill>
     </w:rPr>
   </w:style>
-  <w:style w:type="paragraph" w:styleId="144">
+  <w:style w:type="paragraph" w:styleId="145">
     <w:name w:val="List Paragraph"/>
     <w:basedOn w:val="1"/>
     <w:qFormat/>
@@ -17180,22 +17450,23 @@
       <w:contextualSpacing/>
     </w:pPr>
   </w:style>
-  <w:style w:type="character" w:customStyle="1" w:styleId="145">
+  <w:style w:type="character" w:customStyle="1" w:styleId="146">
     <w:name w:val="Body Text Char"/>
-    <w:basedOn w:val="132"/>
+    <w:basedOn w:val="133"/>
     <w:link w:val="19"/>
     <w:qFormat/>
     <w:uiPriority w:val="99"/>
   </w:style>
-  <w:style w:type="character" w:customStyle="1" w:styleId="146">
+  <w:style w:type="character" w:customStyle="1" w:styleId="147">
     <w:name w:val="Body Text 2 Char"/>
-    <w:basedOn w:val="132"/>
+    <w:basedOn w:val="133"/>
     <w:link w:val="28"/>
+    <w:qFormat/>
     <w:uiPriority w:val="99"/>
   </w:style>
-  <w:style w:type="character" w:customStyle="1" w:styleId="147">
+  <w:style w:type="character" w:customStyle="1" w:styleId="148">
     <w:name w:val="Body Text 3 Char"/>
-    <w:basedOn w:val="132"/>
+    <w:basedOn w:val="133"/>
     <w:link w:val="17"/>
     <w:qFormat/>
     <w:uiPriority w:val="99"/>
@@ -17204,10 +17475,11 @@
       <w:szCs w:val="16"/>
     </w:rPr>
   </w:style>
-  <w:style w:type="character" w:customStyle="1" w:styleId="148">
+  <w:style w:type="character" w:customStyle="1" w:styleId="149">
     <w:name w:val="Macro Text Char"/>
-    <w:basedOn w:val="132"/>
+    <w:basedOn w:val="133"/>
     <w:link w:val="2"/>
+    <w:qFormat/>
     <w:uiPriority w:val="99"/>
     <w:rPr>
       <w:rFonts w:ascii="Courier" w:hAnsi="Courier"/>
@@ -17215,10 +17487,27 @@
       <w:szCs w:val="20"/>
     </w:rPr>
   </w:style>
-  <w:style w:type="paragraph" w:styleId="149">
+  <w:style w:type="paragraph" w:styleId="150">
     <w:name w:val="Quote"/>
     <w:basedOn w:val="1"/>
     <w:next w:val="1"/>
+    <w:link w:val="151"/>
+    <w:qFormat/>
+    <w:uiPriority w:val="29"/>
+    <w:rPr>
+      <w:i/>
+      <w:iCs/>
+      <w:color w:val="000000" w:themeColor="text1"/>
+      <w14:textFill>
+        <w14:solidFill>
+          <w14:schemeClr w14:val="tx1"/>
+        </w14:solidFill>
+      </w14:textFill>
+    </w:rPr>
+  </w:style>
+  <w:style w:type="character" w:customStyle="1" w:styleId="151">
+    <w:name w:val="Quote Char"/>
+    <w:basedOn w:val="133"/>
     <w:link w:val="150"/>
     <w:qFormat/>
     <w:uiPriority w:val="29"/>
@@ -17233,26 +17522,9 @@
       </w14:textFill>
     </w:rPr>
   </w:style>
-  <w:style w:type="character" w:customStyle="1" w:styleId="150">
-    <w:name w:val="Quote Char"/>
-    <w:basedOn w:val="132"/>
-    <w:link w:val="149"/>
-    <w:qFormat/>
-    <w:uiPriority w:val="29"/>
-    <w:rPr>
-      <w:i/>
-      <w:iCs/>
-      <w:color w:val="000000" w:themeColor="text1"/>
-      <w14:textFill>
-        <w14:solidFill>
-          <w14:schemeClr w14:val="tx1"/>
-        </w14:solidFill>
-      </w14:textFill>
-    </w:rPr>
-  </w:style>
-  <w:style w:type="character" w:customStyle="1" w:styleId="151">
+  <w:style w:type="character" w:customStyle="1" w:styleId="152">
     <w:name w:val="Heading 4 Char"/>
-    <w:basedOn w:val="132"/>
+    <w:basedOn w:val="133"/>
     <w:link w:val="6"/>
     <w:semiHidden/>
     <w:qFormat/>
@@ -17271,22 +17543,24 @@
       </w14:textFill>
     </w:rPr>
   </w:style>
-  <w:style w:type="character" w:customStyle="1" w:styleId="152">
+  <w:style w:type="character" w:customStyle="1" w:styleId="153">
     <w:name w:val="Heading 5 Char"/>
-    <w:basedOn w:val="132"/>
+    <w:basedOn w:val="133"/>
     <w:link w:val="7"/>
     <w:semiHidden/>
+    <w:qFormat/>
     <w:uiPriority w:val="9"/>
     <w:rPr>
       <w:rFonts w:asciiTheme="majorHAnsi" w:hAnsiTheme="majorHAnsi" w:eastAsiaTheme="majorEastAsia" w:cstheme="majorBidi"/>
       <w:color w:val="254061" w:themeColor="accent1" w:themeShade="80"/>
     </w:rPr>
   </w:style>
-  <w:style w:type="character" w:customStyle="1" w:styleId="153">
+  <w:style w:type="character" w:customStyle="1" w:styleId="154">
     <w:name w:val="Heading 6 Char"/>
-    <w:basedOn w:val="132"/>
+    <w:basedOn w:val="133"/>
     <w:link w:val="8"/>
     <w:semiHidden/>
+    <w:qFormat/>
     <w:uiPriority w:val="9"/>
     <w:rPr>
       <w:rFonts w:asciiTheme="majorHAnsi" w:hAnsiTheme="majorHAnsi" w:eastAsiaTheme="majorEastAsia" w:cstheme="majorBidi"/>
@@ -17295,9 +17569,9 @@
       <w:color w:val="254061" w:themeColor="accent1" w:themeShade="80"/>
     </w:rPr>
   </w:style>
-  <w:style w:type="character" w:customStyle="1" w:styleId="154">
+  <w:style w:type="character" w:customStyle="1" w:styleId="155">
     <w:name w:val="Heading 7 Char"/>
-    <w:basedOn w:val="132"/>
+    <w:basedOn w:val="133"/>
     <w:link w:val="9"/>
     <w:semiHidden/>
     <w:qFormat/>
@@ -17317,9 +17591,9 @@
       </w14:textFill>
     </w:rPr>
   </w:style>
-  <w:style w:type="character" w:customStyle="1" w:styleId="155">
+  <w:style w:type="character" w:customStyle="1" w:styleId="156">
     <w:name w:val="Heading 8 Char"/>
-    <w:basedOn w:val="132"/>
+    <w:basedOn w:val="133"/>
     <w:link w:val="10"/>
     <w:semiHidden/>
     <w:qFormat/>
@@ -17336,9 +17610,9 @@
       </w14:textFill>
     </w:rPr>
   </w:style>
-  <w:style w:type="character" w:customStyle="1" w:styleId="156">
+  <w:style w:type="character" w:customStyle="1" w:styleId="157">
     <w:name w:val="Heading 9 Char"/>
-    <w:basedOn w:val="132"/>
+    <w:basedOn w:val="133"/>
     <w:link w:val="11"/>
     <w:semiHidden/>
     <w:qFormat/>
@@ -17360,11 +17634,11 @@
       </w14:textFill>
     </w:rPr>
   </w:style>
-  <w:style w:type="paragraph" w:styleId="157">
+  <w:style w:type="paragraph" w:styleId="158">
     <w:name w:val="Intense Quote"/>
     <w:basedOn w:val="1"/>
     <w:next w:val="1"/>
-    <w:link w:val="158"/>
+    <w:link w:val="159"/>
     <w:qFormat/>
     <w:uiPriority w:val="30"/>
     <w:pPr>
@@ -17387,10 +17661,10 @@
       </w14:textFill>
     </w:rPr>
   </w:style>
-  <w:style w:type="character" w:customStyle="1" w:styleId="158">
+  <w:style w:type="character" w:customStyle="1" w:styleId="159">
     <w:name w:val="Intense Quote Char"/>
-    <w:basedOn w:val="132"/>
-    <w:link w:val="157"/>
+    <w:basedOn w:val="133"/>
+    <w:link w:val="158"/>
     <w:qFormat/>
     <w:uiPriority w:val="30"/>
     <w:rPr>
@@ -17406,9 +17680,9 @@
       </w14:textFill>
     </w:rPr>
   </w:style>
-  <w:style w:type="character" w:customStyle="1" w:styleId="159">
+  <w:style w:type="character" w:customStyle="1" w:styleId="160">
     <w:name w:val="Subtle Emphasis"/>
-    <w:basedOn w:val="132"/>
+    <w:basedOn w:val="133"/>
     <w:qFormat/>
     <w:uiPriority w:val="19"/>
     <w:rPr>
@@ -17425,9 +17699,9 @@
       </w14:textFill>
     </w:rPr>
   </w:style>
-  <w:style w:type="character" w:customStyle="1" w:styleId="160">
+  <w:style w:type="character" w:customStyle="1" w:styleId="161">
     <w:name w:val="Intense Emphasis"/>
-    <w:basedOn w:val="132"/>
+    <w:basedOn w:val="133"/>
     <w:qFormat/>
     <w:uiPriority w:val="21"/>
     <w:rPr>
@@ -17443,9 +17717,9 @@
       </w14:textFill>
     </w:rPr>
   </w:style>
-  <w:style w:type="character" w:customStyle="1" w:styleId="161">
+  <w:style w:type="character" w:customStyle="1" w:styleId="162">
     <w:name w:val="Subtle Reference"/>
-    <w:basedOn w:val="132"/>
+    <w:basedOn w:val="133"/>
     <w:qFormat/>
     <w:uiPriority w:val="31"/>
     <w:rPr>
@@ -17459,9 +17733,9 @@
       </w14:textFill>
     </w:rPr>
   </w:style>
-  <w:style w:type="character" w:customStyle="1" w:styleId="162">
+  <w:style w:type="character" w:customStyle="1" w:styleId="163">
     <w:name w:val="Intense Reference"/>
-    <w:basedOn w:val="132"/>
+    <w:basedOn w:val="133"/>
     <w:qFormat/>
     <w:uiPriority w:val="32"/>
     <w:rPr>
@@ -17478,9 +17752,9 @@
       </w14:textFill>
     </w:rPr>
   </w:style>
-  <w:style w:type="character" w:customStyle="1" w:styleId="163">
+  <w:style w:type="character" w:customStyle="1" w:styleId="164">
     <w:name w:val="Book Title"/>
-    <w:basedOn w:val="132"/>
+    <w:basedOn w:val="133"/>
     <w:qFormat/>
     <w:uiPriority w:val="33"/>
     <w:rPr>
@@ -17490,7 +17764,7 @@
       <w:spacing w:val="5"/>
     </w:rPr>
   </w:style>
-  <w:style w:type="paragraph" w:customStyle="1" w:styleId="164">
+  <w:style w:type="paragraph" w:customStyle="1" w:styleId="165">
     <w:name w:val="TOC Heading"/>
     <w:basedOn w:val="3"/>
     <w:next w:val="1"/>

</xml_diff>